<commit_message>
fix(encoding): prevenir corrupcion de caracteres en verbos y actualizar plantillas de supervision
</commit_message>
<xml_diff>
--- a/plantillas/INFORME_SUPERVISION_TEMPLATE.docx
+++ b/plantillas/INFORME_SUPERVISION_TEMPLATE.docx
@@ -1,6 +1,6 @@
 
 <file path=word/document.xml><?xml version="1.0" encoding="utf-8"?>
-<w:document xmlns:wpc="http://schemas.microsoft.com/office/word/2010/wordprocessingCanvas" xmlns:cx="http://schemas.microsoft.com/office/drawing/2014/chartex" xmlns:cx1="http://schemas.microsoft.com/office/drawing/2015/9/8/chartex" xmlns:cx2="http://schemas.microsoft.com/office/drawing/2015/10/21/chartex" xmlns:cx3="http://schemas.microsoft.com/office/drawing/2016/5/9/chartex" xmlns:cx4="http://schemas.microsoft.com/office/drawing/2016/5/10/chartex" xmlns:cx5="http://schemas.microsoft.com/office/drawing/2016/5/11/chartex" xmlns:cx6="http://schemas.microsoft.com/office/drawing/2016/5/12/chartex" xmlns:cx7="http://schemas.microsoft.com/office/drawing/2016/5/13/chartex" xmlns:cx8="http://schemas.microsoft.com/office/drawing/2016/5/14/chartex" xmlns:mc="http://schemas.openxmlformats.org/markup-compatibility/2006" xmlns:aink="http://schemas.microsoft.com/office/drawing/2016/ink" xmlns:am3d="http://schemas.microsoft.com/office/drawing/2017/model3d" xmlns:o="urn:schemas-microsoft-com:office:office" xmlns:oel="http://schemas.microsoft.com/office/2019/extlst" xmlns:r="http://schemas.openxmlformats.org/officeDocument/2006/relationships" xmlns:m="http://schemas.openxmlformats.org/officeDocument/2006/math" xmlns:v="urn:schemas-microsoft-com:vml" xmlns:wp14="http://schemas.microsoft.com/office/word/2010/wordprocessingDrawing" xmlns:wp="http://schemas.openxmlformats.org/drawingml/2006/wordprocessingDrawing" xmlns:w10="urn:schemas-microsoft-com:office:word" xmlns:w="http://schemas.openxmlformats.org/wordprocessingml/2006/main" xmlns:w14="http://schemas.microsoft.com/office/word/2010/wordml" xmlns:w15="http://schemas.microsoft.com/office/word/2012/wordml" xmlns:w16cex="http://schemas.microsoft.com/office/word/2018/wordml/cex" xmlns:w16cid="http://schemas.microsoft.com/office/word/2016/wordml/cid" xmlns:w16="http://schemas.microsoft.com/office/word/2018/wordml" xmlns:w16du="http://schemas.microsoft.com/office/word/2023/wordml/word16du" xmlns:w16sdtdh="http://schemas.microsoft.com/office/word/2020/wordml/sdtdatahash" xmlns:w16sdtfl="http://schemas.microsoft.com/office/word/2024/wordml/sdtformatlock" xmlns:w16se="http://schemas.microsoft.com/office/word/2015/wordml/symex" xmlns:wpg="http://schemas.microsoft.com/office/word/2010/wordprocessingGroup" xmlns:wpi="http://schemas.microsoft.com/office/word/2010/wordprocessingInk" xmlns:wne="http://schemas.microsoft.com/office/word/2006/wordml" xmlns:wps="http://schemas.microsoft.com/office/word/2010/wordprocessingShape" mc:Ignorable="w14 w15 w16se w16cid w16 w16cex w16sdtdh w16sdtfl w16du wp14">
+<w:document xmlns:wpc="http://schemas.microsoft.com/office/word/2010/wordprocessingCanvas" xmlns:mc="http://schemas.openxmlformats.org/markup-compatibility/2006" xmlns:o="urn:schemas-microsoft-com:office:office" xmlns:r="http://schemas.openxmlformats.org/officeDocument/2006/relationships" xmlns:m="http://schemas.openxmlformats.org/officeDocument/2006/math" xmlns:v="urn:schemas-microsoft-com:vml" xmlns:wp14="http://schemas.microsoft.com/office/word/2010/wordprocessingDrawing" xmlns:wp="http://schemas.openxmlformats.org/drawingml/2006/wordprocessingDrawing" xmlns:w10="urn:schemas-microsoft-com:office:word" xmlns:w="http://schemas.openxmlformats.org/wordprocessingml/2006/main" xmlns:w14="http://schemas.microsoft.com/office/word/2010/wordml" xmlns:wpg="http://schemas.microsoft.com/office/word/2010/wordprocessingGroup" xmlns:wpi="http://schemas.microsoft.com/office/word/2010/wordprocessingInk" xmlns:wne="http://schemas.microsoft.com/office/word/2006/wordml" xmlns:wps="http://schemas.microsoft.com/office/word/2010/wordprocessingShape" mc:Ignorable="w14 wp14">
   <w:body>
     <w:tbl>
       <w:tblPr>
@@ -193,7 +193,7 @@
                     </wp:anchor>
                   </w:drawing>
                 </mc:Choice>
-                <mc:Fallback>
+                <mc:Fallback xmlns:w16se="http://schemas.microsoft.com/office/word/2015/wordml/symex" xmlns:w16sdtfl="http://schemas.microsoft.com/office/word/2024/wordml/sdtformatlock" xmlns:w16sdtdh="http://schemas.microsoft.com/office/word/2020/wordml/sdtdatahash" xmlns:w16du="http://schemas.microsoft.com/office/word/2023/wordml/word16du" xmlns:w16="http://schemas.microsoft.com/office/word/2018/wordml" xmlns:w16cid="http://schemas.microsoft.com/office/word/2016/wordml/cid" xmlns:w16cex="http://schemas.microsoft.com/office/word/2018/wordml/cex" xmlns:w15="http://schemas.microsoft.com/office/word/2012/wordml" xmlns:oel="http://schemas.microsoft.com/office/2019/extlst" xmlns:am3d="http://schemas.microsoft.com/office/drawing/2017/model3d" xmlns:aink="http://schemas.microsoft.com/office/drawing/2016/ink" xmlns:cx8="http://schemas.microsoft.com/office/drawing/2016/5/14/chartex" xmlns:cx7="http://schemas.microsoft.com/office/drawing/2016/5/13/chartex" xmlns:cx6="http://schemas.microsoft.com/office/drawing/2016/5/12/chartex" xmlns:cx5="http://schemas.microsoft.com/office/drawing/2016/5/11/chartex" xmlns:cx4="http://schemas.microsoft.com/office/drawing/2016/5/10/chartex" xmlns:cx3="http://schemas.microsoft.com/office/drawing/2016/5/9/chartex" xmlns:cx2="http://schemas.microsoft.com/office/drawing/2015/10/21/chartex" xmlns:cx1="http://schemas.microsoft.com/office/drawing/2015/9/8/chartex" xmlns:cx="http://schemas.microsoft.com/office/drawing/2014/chartex">
                   <w:pict>
                     <v:rect w14:anchorId="6BDD161C" id="Rectangle 2" o:spid="_x0000_s1026" style="position:absolute;left:0;text-align:left;margin-left:355.25pt;margin-top:11.4pt;width:15.75pt;height:14.25pt;z-index:251659264;visibility:visible;mso-wrap-style:square;mso-width-percent:0;mso-height-percent:0;mso-wrap-distance-left:9pt;mso-wrap-distance-top:0;mso-wrap-distance-right:9pt;mso-wrap-distance-bottom:0;mso-position-horizontal:absolute;mso-position-horizontal-relative:text;mso-position-vertical:absolute;mso-position-vertical-relative:text;mso-width-percent:0;mso-height-percent:0;mso-width-relative:page;mso-height-relative:page;v-text-anchor:top" o:gfxdata="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" strokeweight=".26467mm">
                       <v:path arrowok="t"/>
@@ -320,7 +320,7 @@
                     </wp:anchor>
                   </w:drawing>
                 </mc:Choice>
-                <mc:Fallback>
+                <mc:Fallback xmlns:w16se="http://schemas.microsoft.com/office/word/2015/wordml/symex" xmlns:w16sdtfl="http://schemas.microsoft.com/office/word/2024/wordml/sdtformatlock" xmlns:w16sdtdh="http://schemas.microsoft.com/office/word/2020/wordml/sdtdatahash" xmlns:w16du="http://schemas.microsoft.com/office/word/2023/wordml/word16du" xmlns:w16="http://schemas.microsoft.com/office/word/2018/wordml" xmlns:w16cid="http://schemas.microsoft.com/office/word/2016/wordml/cid" xmlns:w16cex="http://schemas.microsoft.com/office/word/2018/wordml/cex" xmlns:w15="http://schemas.microsoft.com/office/word/2012/wordml" xmlns:oel="http://schemas.microsoft.com/office/2019/extlst" xmlns:am3d="http://schemas.microsoft.com/office/drawing/2017/model3d" xmlns:aink="http://schemas.microsoft.com/office/drawing/2016/ink" xmlns:cx8="http://schemas.microsoft.com/office/drawing/2016/5/14/chartex" xmlns:cx7="http://schemas.microsoft.com/office/drawing/2016/5/13/chartex" xmlns:cx6="http://schemas.microsoft.com/office/drawing/2016/5/12/chartex" xmlns:cx5="http://schemas.microsoft.com/office/drawing/2016/5/11/chartex" xmlns:cx4="http://schemas.microsoft.com/office/drawing/2016/5/10/chartex" xmlns:cx3="http://schemas.microsoft.com/office/drawing/2016/5/9/chartex" xmlns:cx2="http://schemas.microsoft.com/office/drawing/2015/10/21/chartex" xmlns:cx1="http://schemas.microsoft.com/office/drawing/2015/9/8/chartex" xmlns:cx="http://schemas.microsoft.com/office/drawing/2014/chartex">
                   <w:pict>
                     <v:rect w14:anchorId="50BD4EA7" id="_x0000_s1027" style="position:absolute;left:0;text-align:left;margin-left:124.35pt;margin-top:11.35pt;width:15.75pt;height:14.25pt;z-index:251657216;visibility:visible;mso-wrap-style:square;mso-width-percent:0;mso-height-percent:0;mso-wrap-distance-left:9pt;mso-wrap-distance-top:0;mso-wrap-distance-right:9pt;mso-wrap-distance-bottom:0;mso-position-horizontal:absolute;mso-position-horizontal-relative:text;mso-position-vertical:absolute;mso-position-vertical-relative:text;mso-width-percent:0;mso-height-percent:0;mso-width-relative:page;mso-height-relative:page;v-text-anchor:top" o:gfxdata="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" strokeweight=".26467mm">
                       <v:path arrowok="t"/>
@@ -1477,7 +1477,16 @@
                 <w:rFonts w:ascii="Arial" w:hAnsi="Arial" w:cs="Arial"/>
                 <w:szCs w:val="24"/>
               </w:rPr>
-              <w:t>${VALOR_INICIAL_LETRAS} M/CTE ($${VALOR_INICIAL_NUMEROS}).</w:t>
+              <w:t>${VALOR_INICIAL_LETRAS}</w:t>
+            </w:r>
+            <w:bookmarkStart w:id="0" w:name="_GoBack"/>
+            <w:bookmarkEnd w:id="0"/>
+            <w:r>
+              <w:rPr>
+                <w:rFonts w:ascii="Arial" w:hAnsi="Arial" w:cs="Arial"/>
+                <w:szCs w:val="24"/>
+              </w:rPr>
+              <w:t xml:space="preserve"> ($${VALOR_INICIAL_NUMEROS}).</w:t>
             </w:r>
           </w:p>
           <w:p>
@@ -2808,7 +2817,23 @@
                 <w:sz w:val="24"/>
                 <w:szCs w:val="24"/>
               </w:rPr>
-              <w:t>${PLANILLA_PERIODO}</w:t>
+              <w:t>${PLAN</w:t>
+            </w:r>
+            <w:r>
+              <w:rPr>
+                <w:rFonts w:ascii="Arial" w:eastAsia="Arial" w:hAnsi="Arial" w:cs="Arial"/>
+                <w:sz w:val="24"/>
+                <w:szCs w:val="24"/>
+              </w:rPr>
+              <w:t>I</w:t>
+            </w:r>
+            <w:r>
+              <w:rPr>
+                <w:rFonts w:ascii="Arial" w:eastAsia="Arial" w:hAnsi="Arial" w:cs="Arial"/>
+                <w:sz w:val="24"/>
+                <w:szCs w:val="24"/>
+              </w:rPr>
+              <w:t>LLA_PERIODO}</w:t>
             </w:r>
           </w:p>
         </w:tc>
@@ -3748,8 +3773,8 @@
       </w:pPr>
     </w:p>
     <w:sectPr>
-      <w:headerReference w:type="default" r:id="rId8"/>
-      <w:footerReference w:type="default" r:id="rId9"/>
+      <w:headerReference w:type="default" r:id="rId9"/>
+      <w:footerReference w:type="default" r:id="rId10"/>
       <w:pgSz w:w="12242" w:h="15842" w:code="1"/>
       <w:pgMar w:top="1134" w:right="1134" w:bottom="1701" w:left="1134" w:header="1134" w:footer="1134" w:gutter="0"/>
       <w:cols w:space="720"/>
@@ -3759,7 +3784,7 @@
 </file>
 
 <file path=word/endnotes.xml><?xml version="1.0" encoding="utf-8"?>
-<w:endnotes xmlns:wpc="http://schemas.microsoft.com/office/word/2010/wordprocessingCanvas" xmlns:cx="http://schemas.microsoft.com/office/drawing/2014/chartex" xmlns:cx1="http://schemas.microsoft.com/office/drawing/2015/9/8/chartex" xmlns:cx2="http://schemas.microsoft.com/office/drawing/2015/10/21/chartex" xmlns:cx3="http://schemas.microsoft.com/office/drawing/2016/5/9/chartex" xmlns:cx4="http://schemas.microsoft.com/office/drawing/2016/5/10/chartex" xmlns:cx5="http://schemas.microsoft.com/office/drawing/2016/5/11/chartex" xmlns:cx6="http://schemas.microsoft.com/office/drawing/2016/5/12/chartex" xmlns:cx7="http://schemas.microsoft.com/office/drawing/2016/5/13/chartex" xmlns:cx8="http://schemas.microsoft.com/office/drawing/2016/5/14/chartex" xmlns:mc="http://schemas.openxmlformats.org/markup-compatibility/2006" xmlns:aink="http://schemas.microsoft.com/office/drawing/2016/ink" xmlns:am3d="http://schemas.microsoft.com/office/drawing/2017/model3d" xmlns:o="urn:schemas-microsoft-com:office:office" xmlns:oel="http://schemas.microsoft.com/office/2019/extlst" xmlns:r="http://schemas.openxmlformats.org/officeDocument/2006/relationships" xmlns:m="http://schemas.openxmlformats.org/officeDocument/2006/math" xmlns:v="urn:schemas-microsoft-com:vml" xmlns:wp14="http://schemas.microsoft.com/office/word/2010/wordprocessingDrawing" xmlns:wp="http://schemas.openxmlformats.org/drawingml/2006/wordprocessingDrawing" xmlns:w10="urn:schemas-microsoft-com:office:word" xmlns:w="http://schemas.openxmlformats.org/wordprocessingml/2006/main" xmlns:w14="http://schemas.microsoft.com/office/word/2010/wordml" xmlns:w15="http://schemas.microsoft.com/office/word/2012/wordml" xmlns:w16cex="http://schemas.microsoft.com/office/word/2018/wordml/cex" xmlns:w16cid="http://schemas.microsoft.com/office/word/2016/wordml/cid" xmlns:w16="http://schemas.microsoft.com/office/word/2018/wordml" xmlns:w16du="http://schemas.microsoft.com/office/word/2023/wordml/word16du" xmlns:w16sdtdh="http://schemas.microsoft.com/office/word/2020/wordml/sdtdatahash" xmlns:w16sdtfl="http://schemas.microsoft.com/office/word/2024/wordml/sdtformatlock" xmlns:w16se="http://schemas.microsoft.com/office/word/2015/wordml/symex" xmlns:wpg="http://schemas.microsoft.com/office/word/2010/wordprocessingGroup" xmlns:wpi="http://schemas.microsoft.com/office/word/2010/wordprocessingInk" xmlns:wne="http://schemas.microsoft.com/office/word/2006/wordml" xmlns:wps="http://schemas.microsoft.com/office/word/2010/wordprocessingShape" mc:Ignorable="w14 w15 w16se w16cid w16 w16cex w16sdtdh w16sdtfl w16du wp14">
+<w:endnotes xmlns:wpc="http://schemas.microsoft.com/office/word/2010/wordprocessingCanvas" xmlns:mc="http://schemas.openxmlformats.org/markup-compatibility/2006" xmlns:o="urn:schemas-microsoft-com:office:office" xmlns:r="http://schemas.openxmlformats.org/officeDocument/2006/relationships" xmlns:m="http://schemas.openxmlformats.org/officeDocument/2006/math" xmlns:v="urn:schemas-microsoft-com:vml" xmlns:wp14="http://schemas.microsoft.com/office/word/2010/wordprocessingDrawing" xmlns:wp="http://schemas.openxmlformats.org/drawingml/2006/wordprocessingDrawing" xmlns:w10="urn:schemas-microsoft-com:office:word" xmlns:w="http://schemas.openxmlformats.org/wordprocessingml/2006/main" xmlns:w14="http://schemas.microsoft.com/office/word/2010/wordml" xmlns:wpg="http://schemas.microsoft.com/office/word/2010/wordprocessingGroup" xmlns:wpi="http://schemas.microsoft.com/office/word/2010/wordprocessingInk" xmlns:wne="http://schemas.microsoft.com/office/word/2006/wordml" xmlns:wps="http://schemas.microsoft.com/office/word/2010/wordprocessingShape" mc:Ignorable="w14 wp14">
   <w:endnote w:type="separator" w:id="-1">
     <w:p>
       <w:r>
@@ -3778,7 +3803,7 @@
 </file>
 
 <file path=word/footer1.xml><?xml version="1.0" encoding="utf-8"?>
-<w:ftr xmlns:wpc="http://schemas.microsoft.com/office/word/2010/wordprocessingCanvas" xmlns:cx="http://schemas.microsoft.com/office/drawing/2014/chartex" xmlns:cx1="http://schemas.microsoft.com/office/drawing/2015/9/8/chartex" xmlns:cx2="http://schemas.microsoft.com/office/drawing/2015/10/21/chartex" xmlns:cx3="http://schemas.microsoft.com/office/drawing/2016/5/9/chartex" xmlns:cx4="http://schemas.microsoft.com/office/drawing/2016/5/10/chartex" xmlns:cx5="http://schemas.microsoft.com/office/drawing/2016/5/11/chartex" xmlns:cx6="http://schemas.microsoft.com/office/drawing/2016/5/12/chartex" xmlns:cx7="http://schemas.microsoft.com/office/drawing/2016/5/13/chartex" xmlns:cx8="http://schemas.microsoft.com/office/drawing/2016/5/14/chartex" xmlns:mc="http://schemas.openxmlformats.org/markup-compatibility/2006" xmlns:aink="http://schemas.microsoft.com/office/drawing/2016/ink" xmlns:am3d="http://schemas.microsoft.com/office/drawing/2017/model3d" xmlns:o="urn:schemas-microsoft-com:office:office" xmlns:oel="http://schemas.microsoft.com/office/2019/extlst" xmlns:r="http://schemas.openxmlformats.org/officeDocument/2006/relationships" xmlns:m="http://schemas.openxmlformats.org/officeDocument/2006/math" xmlns:v="urn:schemas-microsoft-com:vml" xmlns:wp14="http://schemas.microsoft.com/office/word/2010/wordprocessingDrawing" xmlns:wp="http://schemas.openxmlformats.org/drawingml/2006/wordprocessingDrawing" xmlns:w10="urn:schemas-microsoft-com:office:word" xmlns:w="http://schemas.openxmlformats.org/wordprocessingml/2006/main" xmlns:w14="http://schemas.microsoft.com/office/word/2010/wordml" xmlns:w15="http://schemas.microsoft.com/office/word/2012/wordml" xmlns:w16cex="http://schemas.microsoft.com/office/word/2018/wordml/cex" xmlns:w16cid="http://schemas.microsoft.com/office/word/2016/wordml/cid" xmlns:w16="http://schemas.microsoft.com/office/word/2018/wordml" xmlns:w16du="http://schemas.microsoft.com/office/word/2023/wordml/word16du" xmlns:w16sdtdh="http://schemas.microsoft.com/office/word/2020/wordml/sdtdatahash" xmlns:w16sdtfl="http://schemas.microsoft.com/office/word/2024/wordml/sdtformatlock" xmlns:w16se="http://schemas.microsoft.com/office/word/2015/wordml/symex" xmlns:wpg="http://schemas.microsoft.com/office/word/2010/wordprocessingGroup" xmlns:wpi="http://schemas.microsoft.com/office/word/2010/wordprocessingInk" xmlns:wne="http://schemas.microsoft.com/office/word/2006/wordml" xmlns:wps="http://schemas.microsoft.com/office/word/2010/wordprocessingShape" mc:Ignorable="w14 w15 w16se w16cid w16 w16cex w16sdtdh w16sdtfl w16du wp14">
+<w:ftr xmlns:wpc="http://schemas.microsoft.com/office/word/2010/wordprocessingCanvas" xmlns:mc="http://schemas.openxmlformats.org/markup-compatibility/2006" xmlns:o="urn:schemas-microsoft-com:office:office" xmlns:r="http://schemas.openxmlformats.org/officeDocument/2006/relationships" xmlns:m="http://schemas.openxmlformats.org/officeDocument/2006/math" xmlns:v="urn:schemas-microsoft-com:vml" xmlns:wp14="http://schemas.microsoft.com/office/word/2010/wordprocessingDrawing" xmlns:wp="http://schemas.openxmlformats.org/drawingml/2006/wordprocessingDrawing" xmlns:w10="urn:schemas-microsoft-com:office:word" xmlns:w="http://schemas.openxmlformats.org/wordprocessingml/2006/main" xmlns:w14="http://schemas.microsoft.com/office/word/2010/wordml" xmlns:wpg="http://schemas.microsoft.com/office/word/2010/wordprocessingGroup" xmlns:wpi="http://schemas.microsoft.com/office/word/2010/wordprocessingInk" xmlns:wne="http://schemas.microsoft.com/office/word/2006/wordml" xmlns:wps="http://schemas.microsoft.com/office/word/2010/wordprocessingShape" mc:Ignorable="w14 wp14">
   <w:p>
     <w:pPr>
       <w:pStyle w:val="Piedepgina"/>
@@ -3806,25 +3831,7 @@
         <w:sz w:val="16"/>
         <w:szCs w:val="16"/>
       </w:rPr>
-      <w:t xml:space="preserve"> de Santiago de Cali.  Prohibida su alteración o modificación por cualquier medio, sin previa autorización del </w:t>
-    </w:r>
-    <w:proofErr w:type="gramStart"/>
-    <w:r>
-      <w:rPr>
-        <w:rFonts w:ascii="Arial" w:hAnsi="Arial" w:cs="Arial"/>
-        <w:sz w:val="16"/>
-        <w:szCs w:val="16"/>
-      </w:rPr>
-      <w:t>Alcalde</w:t>
-    </w:r>
-    <w:proofErr w:type="gramEnd"/>
-    <w:r>
-      <w:rPr>
-        <w:rFonts w:ascii="Arial" w:hAnsi="Arial" w:cs="Arial"/>
-        <w:sz w:val="16"/>
-        <w:szCs w:val="16"/>
-      </w:rPr>
-      <w:t>.</w:t>
+      <w:t xml:space="preserve"> de Santiago de Cali.  Prohibida su alteración o modificación por cualquier medio, sin previa autorización del Alcalde.</w:t>
     </w:r>
   </w:p>
   <w:p>
@@ -3875,7 +3882,7 @@
         <w:sz w:val="16"/>
         <w:szCs w:val="16"/>
       </w:rPr>
-      <w:t>3</w:t>
+      <w:t>1</w:t>
     </w:r>
     <w:r>
       <w:rPr>
@@ -3939,7 +3946,7 @@
 </file>
 
 <file path=word/footnotes.xml><?xml version="1.0" encoding="utf-8"?>
-<w:footnotes xmlns:wpc="http://schemas.microsoft.com/office/word/2010/wordprocessingCanvas" xmlns:cx="http://schemas.microsoft.com/office/drawing/2014/chartex" xmlns:cx1="http://schemas.microsoft.com/office/drawing/2015/9/8/chartex" xmlns:cx2="http://schemas.microsoft.com/office/drawing/2015/10/21/chartex" xmlns:cx3="http://schemas.microsoft.com/office/drawing/2016/5/9/chartex" xmlns:cx4="http://schemas.microsoft.com/office/drawing/2016/5/10/chartex" xmlns:cx5="http://schemas.microsoft.com/office/drawing/2016/5/11/chartex" xmlns:cx6="http://schemas.microsoft.com/office/drawing/2016/5/12/chartex" xmlns:cx7="http://schemas.microsoft.com/office/drawing/2016/5/13/chartex" xmlns:cx8="http://schemas.microsoft.com/office/drawing/2016/5/14/chartex" xmlns:mc="http://schemas.openxmlformats.org/markup-compatibility/2006" xmlns:aink="http://schemas.microsoft.com/office/drawing/2016/ink" xmlns:am3d="http://schemas.microsoft.com/office/drawing/2017/model3d" xmlns:o="urn:schemas-microsoft-com:office:office" xmlns:oel="http://schemas.microsoft.com/office/2019/extlst" xmlns:r="http://schemas.openxmlformats.org/officeDocument/2006/relationships" xmlns:m="http://schemas.openxmlformats.org/officeDocument/2006/math" xmlns:v="urn:schemas-microsoft-com:vml" xmlns:wp14="http://schemas.microsoft.com/office/word/2010/wordprocessingDrawing" xmlns:wp="http://schemas.openxmlformats.org/drawingml/2006/wordprocessingDrawing" xmlns:w10="urn:schemas-microsoft-com:office:word" xmlns:w="http://schemas.openxmlformats.org/wordprocessingml/2006/main" xmlns:w14="http://schemas.microsoft.com/office/word/2010/wordml" xmlns:w15="http://schemas.microsoft.com/office/word/2012/wordml" xmlns:w16cex="http://schemas.microsoft.com/office/word/2018/wordml/cex" xmlns:w16cid="http://schemas.microsoft.com/office/word/2016/wordml/cid" xmlns:w16="http://schemas.microsoft.com/office/word/2018/wordml" xmlns:w16du="http://schemas.microsoft.com/office/word/2023/wordml/word16du" xmlns:w16sdtdh="http://schemas.microsoft.com/office/word/2020/wordml/sdtdatahash" xmlns:w16sdtfl="http://schemas.microsoft.com/office/word/2024/wordml/sdtformatlock" xmlns:w16se="http://schemas.microsoft.com/office/word/2015/wordml/symex" xmlns:wpg="http://schemas.microsoft.com/office/word/2010/wordprocessingGroup" xmlns:wpi="http://schemas.microsoft.com/office/word/2010/wordprocessingInk" xmlns:wne="http://schemas.microsoft.com/office/word/2006/wordml" xmlns:wps="http://schemas.microsoft.com/office/word/2010/wordprocessingShape" mc:Ignorable="w14 w15 w16se w16cid w16 w16cex w16sdtdh w16sdtfl w16du wp14">
+<w:footnotes xmlns:wpc="http://schemas.microsoft.com/office/word/2010/wordprocessingCanvas" xmlns:mc="http://schemas.openxmlformats.org/markup-compatibility/2006" xmlns:o="urn:schemas-microsoft-com:office:office" xmlns:r="http://schemas.openxmlformats.org/officeDocument/2006/relationships" xmlns:m="http://schemas.openxmlformats.org/officeDocument/2006/math" xmlns:v="urn:schemas-microsoft-com:vml" xmlns:wp14="http://schemas.microsoft.com/office/word/2010/wordprocessingDrawing" xmlns:wp="http://schemas.openxmlformats.org/drawingml/2006/wordprocessingDrawing" xmlns:w10="urn:schemas-microsoft-com:office:word" xmlns:w="http://schemas.openxmlformats.org/wordprocessingml/2006/main" xmlns:w14="http://schemas.microsoft.com/office/word/2010/wordml" xmlns:wpg="http://schemas.microsoft.com/office/word/2010/wordprocessingGroup" xmlns:wpi="http://schemas.microsoft.com/office/word/2010/wordprocessingInk" xmlns:wne="http://schemas.microsoft.com/office/word/2006/wordml" xmlns:wps="http://schemas.microsoft.com/office/word/2010/wordprocessingShape" mc:Ignorable="w14 wp14">
   <w:footnote w:type="separator" w:id="-1">
     <w:p>
       <w:r>
@@ -3961,7 +3968,7 @@
 </file>
 
 <file path=word/header1.xml><?xml version="1.0" encoding="utf-8"?>
-<w:hdr xmlns:wpc="http://schemas.microsoft.com/office/word/2010/wordprocessingCanvas" xmlns:cx="http://schemas.microsoft.com/office/drawing/2014/chartex" xmlns:cx1="http://schemas.microsoft.com/office/drawing/2015/9/8/chartex" xmlns:cx2="http://schemas.microsoft.com/office/drawing/2015/10/21/chartex" xmlns:cx3="http://schemas.microsoft.com/office/drawing/2016/5/9/chartex" xmlns:cx4="http://schemas.microsoft.com/office/drawing/2016/5/10/chartex" xmlns:cx5="http://schemas.microsoft.com/office/drawing/2016/5/11/chartex" xmlns:cx6="http://schemas.microsoft.com/office/drawing/2016/5/12/chartex" xmlns:cx7="http://schemas.microsoft.com/office/drawing/2016/5/13/chartex" xmlns:cx8="http://schemas.microsoft.com/office/drawing/2016/5/14/chartex" xmlns:mc="http://schemas.openxmlformats.org/markup-compatibility/2006" xmlns:aink="http://schemas.microsoft.com/office/drawing/2016/ink" xmlns:am3d="http://schemas.microsoft.com/office/drawing/2017/model3d" xmlns:o="urn:schemas-microsoft-com:office:office" xmlns:oel="http://schemas.microsoft.com/office/2019/extlst" xmlns:r="http://schemas.openxmlformats.org/officeDocument/2006/relationships" xmlns:m="http://schemas.openxmlformats.org/officeDocument/2006/math" xmlns:v="urn:schemas-microsoft-com:vml" xmlns:wp14="http://schemas.microsoft.com/office/word/2010/wordprocessingDrawing" xmlns:wp="http://schemas.openxmlformats.org/drawingml/2006/wordprocessingDrawing" xmlns:w10="urn:schemas-microsoft-com:office:word" xmlns:w="http://schemas.openxmlformats.org/wordprocessingml/2006/main" xmlns:w14="http://schemas.microsoft.com/office/word/2010/wordml" xmlns:w15="http://schemas.microsoft.com/office/word/2012/wordml" xmlns:w16cex="http://schemas.microsoft.com/office/word/2018/wordml/cex" xmlns:w16cid="http://schemas.microsoft.com/office/word/2016/wordml/cid" xmlns:w16="http://schemas.microsoft.com/office/word/2018/wordml" xmlns:w16du="http://schemas.microsoft.com/office/word/2023/wordml/word16du" xmlns:w16sdtdh="http://schemas.microsoft.com/office/word/2020/wordml/sdtdatahash" xmlns:w16sdtfl="http://schemas.microsoft.com/office/word/2024/wordml/sdtformatlock" xmlns:w16se="http://schemas.microsoft.com/office/word/2015/wordml/symex" xmlns:wpg="http://schemas.microsoft.com/office/word/2010/wordprocessingGroup" xmlns:wpi="http://schemas.microsoft.com/office/word/2010/wordprocessingInk" xmlns:wne="http://schemas.microsoft.com/office/word/2006/wordml" xmlns:wps="http://schemas.microsoft.com/office/word/2010/wordprocessingShape" mc:Ignorable="w14 w15 w16se w16cid w16 w16cex w16sdtdh w16sdtfl w16du wp14">
+<w:hdr xmlns:wpc="http://schemas.microsoft.com/office/word/2010/wordprocessingCanvas" xmlns:mc="http://schemas.openxmlformats.org/markup-compatibility/2006" xmlns:o="urn:schemas-microsoft-com:office:office" xmlns:r="http://schemas.openxmlformats.org/officeDocument/2006/relationships" xmlns:m="http://schemas.openxmlformats.org/officeDocument/2006/math" xmlns:v="urn:schemas-microsoft-com:vml" xmlns:wp14="http://schemas.microsoft.com/office/word/2010/wordprocessingDrawing" xmlns:wp="http://schemas.openxmlformats.org/drawingml/2006/wordprocessingDrawing" xmlns:w10="urn:schemas-microsoft-com:office:word" xmlns:w="http://schemas.openxmlformats.org/wordprocessingml/2006/main" xmlns:w14="http://schemas.microsoft.com/office/word/2010/wordml" xmlns:wpg="http://schemas.microsoft.com/office/word/2010/wordprocessingGroup" xmlns:wpi="http://schemas.microsoft.com/office/word/2010/wordprocessingInk" xmlns:wne="http://schemas.microsoft.com/office/word/2006/wordml" xmlns:wps="http://schemas.microsoft.com/office/word/2010/wordprocessingShape" mc:Ignorable="w14 wp14">
   <w:tbl>
     <w:tblPr>
       <w:tblW w:w="5000" w:type="pct"/>
@@ -4239,25 +4246,7 @@
               <w:color w:val="000000"/>
               <w:shd w:val="clear" w:color="auto" w:fill="FFFFFF"/>
             </w:rPr>
-            <w:t>MAJA01.04.</w:t>
-          </w:r>
-          <w:proofErr w:type="gramStart"/>
-          <w:r>
-            <w:rPr>
-              <w:rFonts w:ascii="Arial" w:hAnsi="Arial" w:cs="Arial"/>
-              <w:color w:val="000000"/>
-              <w:shd w:val="clear" w:color="auto" w:fill="FFFFFF"/>
-            </w:rPr>
-            <w:t>03.P002.F</w:t>
-          </w:r>
-          <w:proofErr w:type="gramEnd"/>
-          <w:r>
-            <w:rPr>
-              <w:rFonts w:ascii="Arial" w:hAnsi="Arial" w:cs="Arial"/>
-              <w:color w:val="000000"/>
-              <w:shd w:val="clear" w:color="auto" w:fill="FFFFFF"/>
-            </w:rPr>
-            <w:t>003</w:t>
+            <w:t>MAJA01.04.03.P002.F003</w:t>
           </w:r>
         </w:p>
       </w:tc>
@@ -4350,8 +4339,8 @@
 </file>
 
 <file path=word/numbering.xml><?xml version="1.0" encoding="utf-8"?>
-<w:numbering xmlns:wpc="http://schemas.microsoft.com/office/word/2010/wordprocessingCanvas" xmlns:cx="http://schemas.microsoft.com/office/drawing/2014/chartex" xmlns:cx1="http://schemas.microsoft.com/office/drawing/2015/9/8/chartex" xmlns:cx2="http://schemas.microsoft.com/office/drawing/2015/10/21/chartex" xmlns:cx3="http://schemas.microsoft.com/office/drawing/2016/5/9/chartex" xmlns:cx4="http://schemas.microsoft.com/office/drawing/2016/5/10/chartex" xmlns:cx5="http://schemas.microsoft.com/office/drawing/2016/5/11/chartex" xmlns:cx6="http://schemas.microsoft.com/office/drawing/2016/5/12/chartex" xmlns:cx7="http://schemas.microsoft.com/office/drawing/2016/5/13/chartex" xmlns:cx8="http://schemas.microsoft.com/office/drawing/2016/5/14/chartex" xmlns:mc="http://schemas.openxmlformats.org/markup-compatibility/2006" xmlns:aink="http://schemas.microsoft.com/office/drawing/2016/ink" xmlns:am3d="http://schemas.microsoft.com/office/drawing/2017/model3d" xmlns:o="urn:schemas-microsoft-com:office:office" xmlns:oel="http://schemas.microsoft.com/office/2019/extlst" xmlns:r="http://schemas.openxmlformats.org/officeDocument/2006/relationships" xmlns:m="http://schemas.openxmlformats.org/officeDocument/2006/math" xmlns:v="urn:schemas-microsoft-com:vml" xmlns:wp14="http://schemas.microsoft.com/office/word/2010/wordprocessingDrawing" xmlns:wp="http://schemas.openxmlformats.org/drawingml/2006/wordprocessingDrawing" xmlns:w10="urn:schemas-microsoft-com:office:word" xmlns:w="http://schemas.openxmlformats.org/wordprocessingml/2006/main" xmlns:w14="http://schemas.microsoft.com/office/word/2010/wordml" xmlns:w15="http://schemas.microsoft.com/office/word/2012/wordml" xmlns:w16cex="http://schemas.microsoft.com/office/word/2018/wordml/cex" xmlns:w16cid="http://schemas.microsoft.com/office/word/2016/wordml/cid" xmlns:w16="http://schemas.microsoft.com/office/word/2018/wordml" xmlns:w16du="http://schemas.microsoft.com/office/word/2023/wordml/word16du" xmlns:w16sdtdh="http://schemas.microsoft.com/office/word/2020/wordml/sdtdatahash" xmlns:w16sdtfl="http://schemas.microsoft.com/office/word/2024/wordml/sdtformatlock" xmlns:w16se="http://schemas.microsoft.com/office/word/2015/wordml/symex" xmlns:wpg="http://schemas.microsoft.com/office/word/2010/wordprocessingGroup" xmlns:wpi="http://schemas.microsoft.com/office/word/2010/wordprocessingInk" xmlns:wne="http://schemas.microsoft.com/office/word/2006/wordml" xmlns:wps="http://schemas.microsoft.com/office/word/2010/wordprocessingShape" mc:Ignorable="w14 w15 w16se w16cid w16 w16cex w16sdtdh w16sdtfl w16du wp14">
-  <w:abstractNum w:abstractNumId="0" w15:restartNumberingAfterBreak="0">
+<w:numbering xmlns:wpc="http://schemas.microsoft.com/office/word/2010/wordprocessingCanvas" xmlns:mc="http://schemas.openxmlformats.org/markup-compatibility/2006" xmlns:o="urn:schemas-microsoft-com:office:office" xmlns:r="http://schemas.openxmlformats.org/officeDocument/2006/relationships" xmlns:m="http://schemas.openxmlformats.org/officeDocument/2006/math" xmlns:v="urn:schemas-microsoft-com:vml" xmlns:wp14="http://schemas.microsoft.com/office/word/2010/wordprocessingDrawing" xmlns:wp="http://schemas.openxmlformats.org/drawingml/2006/wordprocessingDrawing" xmlns:w10="urn:schemas-microsoft-com:office:word" xmlns:w="http://schemas.openxmlformats.org/wordprocessingml/2006/main" xmlns:w14="http://schemas.microsoft.com/office/word/2010/wordml" xmlns:wpg="http://schemas.microsoft.com/office/word/2010/wordprocessingGroup" xmlns:wpi="http://schemas.microsoft.com/office/word/2010/wordprocessingInk" xmlns:wne="http://schemas.microsoft.com/office/word/2006/wordml" xmlns:wps="http://schemas.microsoft.com/office/word/2010/wordprocessingShape" mc:Ignorable="w14 wp14">
+  <w:abstractNum w:abstractNumId="0">
     <w:nsid w:val="04683BB4"/>
     <w:multiLevelType w:val="hybridMultilevel"/>
     <w:tmpl w:val="4F8AC1BC"/>
@@ -4440,7 +4429,7 @@
       </w:pPr>
     </w:lvl>
   </w:abstractNum>
-  <w:abstractNum w:abstractNumId="1" w15:restartNumberingAfterBreak="0">
+  <w:abstractNum w:abstractNumId="1">
     <w:nsid w:val="14B7760E"/>
     <w:multiLevelType w:val="hybridMultilevel"/>
     <w:tmpl w:val="769A5DCE"/>
@@ -4553,7 +4542,7 @@
       </w:rPr>
     </w:lvl>
   </w:abstractNum>
-  <w:abstractNum w:abstractNumId="2" w15:restartNumberingAfterBreak="0">
+  <w:abstractNum w:abstractNumId="2">
     <w:nsid w:val="3FF1308E"/>
     <w:multiLevelType w:val="multilevel"/>
     <w:tmpl w:val="FDDEB0EC"/>
@@ -4666,7 +4655,7 @@
       </w:rPr>
     </w:lvl>
   </w:abstractNum>
-  <w:abstractNum w:abstractNumId="3" w15:restartNumberingAfterBreak="0">
+  <w:abstractNum w:abstractNumId="3">
     <w:nsid w:val="571C1BCA"/>
     <w:multiLevelType w:val="hybridMultilevel"/>
     <w:tmpl w:val="795EA340"/>
@@ -4779,7 +4768,7 @@
       </w:rPr>
     </w:lvl>
   </w:abstractNum>
-  <w:abstractNum w:abstractNumId="4" w15:restartNumberingAfterBreak="0">
+  <w:abstractNum w:abstractNumId="4">
     <w:nsid w:val="74356440"/>
     <w:multiLevelType w:val="hybridMultilevel"/>
     <w:tmpl w:val="509A9A72"/>
@@ -4868,26 +4857,26 @@
       </w:pPr>
     </w:lvl>
   </w:abstractNum>
-  <w:num w:numId="1" w16cid:durableId="950163657">
+  <w:num w:numId="1">
     <w:abstractNumId w:val="4"/>
   </w:num>
-  <w:num w:numId="2" w16cid:durableId="1764260604">
+  <w:num w:numId="2">
     <w:abstractNumId w:val="0"/>
   </w:num>
-  <w:num w:numId="3" w16cid:durableId="786508646">
+  <w:num w:numId="3">
     <w:abstractNumId w:val="2"/>
   </w:num>
-  <w:num w:numId="4" w16cid:durableId="55669857">
+  <w:num w:numId="4">
     <w:abstractNumId w:val="3"/>
   </w:num>
-  <w:num w:numId="5" w16cid:durableId="1998338990">
+  <w:num w:numId="5">
     <w:abstractNumId w:val="1"/>
   </w:num>
 </w:numbering>
 </file>
 
 <file path=word/styles.xml><?xml version="1.0" encoding="utf-8"?>
-<w:styles xmlns:mc="http://schemas.openxmlformats.org/markup-compatibility/2006" xmlns:r="http://schemas.openxmlformats.org/officeDocument/2006/relationships" xmlns:w="http://schemas.openxmlformats.org/wordprocessingml/2006/main" xmlns:w14="http://schemas.microsoft.com/office/word/2010/wordml" xmlns:w15="http://schemas.microsoft.com/office/word/2012/wordml" xmlns:w16cex="http://schemas.microsoft.com/office/word/2018/wordml/cex" xmlns:w16cid="http://schemas.microsoft.com/office/word/2016/wordml/cid" xmlns:w16="http://schemas.microsoft.com/office/word/2018/wordml" xmlns:w16du="http://schemas.microsoft.com/office/word/2023/wordml/word16du" xmlns:w16sdtdh="http://schemas.microsoft.com/office/word/2020/wordml/sdtdatahash" xmlns:w16sdtfl="http://schemas.microsoft.com/office/word/2024/wordml/sdtformatlock" xmlns:w16se="http://schemas.microsoft.com/office/word/2015/wordml/symex" mc:Ignorable="w14 w15 w16se w16cid w16 w16cex w16sdtdh w16sdtfl w16du">
+<w:styles xmlns:mc="http://schemas.openxmlformats.org/markup-compatibility/2006" xmlns:r="http://schemas.openxmlformats.org/officeDocument/2006/relationships" xmlns:w="http://schemas.openxmlformats.org/wordprocessingml/2006/main" xmlns:w14="http://schemas.microsoft.com/office/word/2010/wordml" mc:Ignorable="w14">
   <w:docDefaults>
     <w:rPrDefault>
       <w:rPr>
@@ -4897,383 +4886,145 @@
     </w:rPrDefault>
     <w:pPrDefault/>
   </w:docDefaults>
-  <w:latentStyles w:defLockedState="0" w:defUIPriority="99" w:defSemiHidden="0" w:defUnhideWhenUsed="0" w:defQFormat="0" w:count="376">
-    <w:lsdException w:name="Normal" w:uiPriority="0" w:qFormat="1"/>
-    <w:lsdException w:name="heading 1" w:uiPriority="9" w:qFormat="1"/>
-    <w:lsdException w:name="heading 2" w:semiHidden="1" w:uiPriority="9" w:unhideWhenUsed="1" w:qFormat="1"/>
-    <w:lsdException w:name="heading 3" w:semiHidden="1" w:uiPriority="9" w:unhideWhenUsed="1" w:qFormat="1"/>
-    <w:lsdException w:name="heading 4" w:semiHidden="1" w:uiPriority="9" w:unhideWhenUsed="1" w:qFormat="1"/>
-    <w:lsdException w:name="heading 5" w:semiHidden="1" w:uiPriority="9" w:unhideWhenUsed="1" w:qFormat="1"/>
-    <w:lsdException w:name="heading 6" w:semiHidden="1" w:uiPriority="9" w:unhideWhenUsed="1" w:qFormat="1"/>
-    <w:lsdException w:name="heading 7" w:semiHidden="1" w:uiPriority="9" w:unhideWhenUsed="1" w:qFormat="1"/>
-    <w:lsdException w:name="heading 8" w:semiHidden="1" w:uiPriority="9" w:unhideWhenUsed="1" w:qFormat="1"/>
-    <w:lsdException w:name="heading 9" w:semiHidden="1" w:uiPriority="9" w:unhideWhenUsed="1" w:qFormat="1"/>
-    <w:lsdException w:name="index 1" w:semiHidden="1" w:unhideWhenUsed="1"/>
-    <w:lsdException w:name="index 2" w:semiHidden="1" w:unhideWhenUsed="1"/>
-    <w:lsdException w:name="index 3" w:semiHidden="1" w:unhideWhenUsed="1"/>
-    <w:lsdException w:name="index 4" w:semiHidden="1" w:unhideWhenUsed="1"/>
-    <w:lsdException w:name="index 5" w:semiHidden="1" w:unhideWhenUsed="1"/>
-    <w:lsdException w:name="index 6" w:semiHidden="1" w:unhideWhenUsed="1"/>
-    <w:lsdException w:name="index 7" w:semiHidden="1" w:unhideWhenUsed="1"/>
-    <w:lsdException w:name="index 8" w:semiHidden="1" w:unhideWhenUsed="1"/>
-    <w:lsdException w:name="index 9" w:semiHidden="1" w:unhideWhenUsed="1"/>
-    <w:lsdException w:name="toc 1" w:semiHidden="1" w:uiPriority="39" w:unhideWhenUsed="1"/>
-    <w:lsdException w:name="toc 2" w:semiHidden="1" w:uiPriority="39" w:unhideWhenUsed="1"/>
-    <w:lsdException w:name="toc 3" w:semiHidden="1" w:uiPriority="39" w:unhideWhenUsed="1"/>
-    <w:lsdException w:name="toc 4" w:semiHidden="1" w:uiPriority="39" w:unhideWhenUsed="1"/>
-    <w:lsdException w:name="toc 5" w:semiHidden="1" w:uiPriority="39" w:unhideWhenUsed="1"/>
-    <w:lsdException w:name="toc 6" w:semiHidden="1" w:uiPriority="39" w:unhideWhenUsed="1"/>
-    <w:lsdException w:name="toc 7" w:semiHidden="1" w:uiPriority="39" w:unhideWhenUsed="1"/>
-    <w:lsdException w:name="toc 8" w:semiHidden="1" w:uiPriority="39" w:unhideWhenUsed="1"/>
-    <w:lsdException w:name="toc 9" w:semiHidden="1" w:uiPriority="39" w:unhideWhenUsed="1"/>
-    <w:lsdException w:name="Normal Indent" w:semiHidden="1" w:unhideWhenUsed="1"/>
-    <w:lsdException w:name="footnote text" w:semiHidden="1" w:unhideWhenUsed="1"/>
-    <w:lsdException w:name="annotation text" w:semiHidden="1" w:unhideWhenUsed="1"/>
-    <w:lsdException w:name="header" w:semiHidden="1" w:unhideWhenUsed="1"/>
-    <w:lsdException w:name="footer" w:semiHidden="1" w:unhideWhenUsed="1"/>
-    <w:lsdException w:name="index heading" w:semiHidden="1" w:unhideWhenUsed="1"/>
-    <w:lsdException w:name="caption" w:semiHidden="1" w:uiPriority="35" w:unhideWhenUsed="1" w:qFormat="1"/>
-    <w:lsdException w:name="table of figures" w:semiHidden="1" w:unhideWhenUsed="1"/>
-    <w:lsdException w:name="envelope address" w:semiHidden="1" w:unhideWhenUsed="1"/>
-    <w:lsdException w:name="envelope return" w:semiHidden="1" w:unhideWhenUsed="1"/>
-    <w:lsdException w:name="footnote reference" w:semiHidden="1" w:unhideWhenUsed="1"/>
-    <w:lsdException w:name="annotation reference" w:semiHidden="1" w:unhideWhenUsed="1"/>
-    <w:lsdException w:name="line number" w:semiHidden="1" w:unhideWhenUsed="1"/>
-    <w:lsdException w:name="page number" w:semiHidden="1" w:unhideWhenUsed="1"/>
-    <w:lsdException w:name="endnote reference" w:semiHidden="1" w:unhideWhenUsed="1"/>
-    <w:lsdException w:name="endnote text" w:semiHidden="1" w:unhideWhenUsed="1"/>
-    <w:lsdException w:name="table of authorities" w:semiHidden="1" w:unhideWhenUsed="1"/>
-    <w:lsdException w:name="macro" w:semiHidden="1" w:unhideWhenUsed="1"/>
-    <w:lsdException w:name="toa heading" w:semiHidden="1" w:unhideWhenUsed="1"/>
-    <w:lsdException w:name="List" w:semiHidden="1" w:unhideWhenUsed="1"/>
-    <w:lsdException w:name="List Bullet" w:semiHidden="1" w:unhideWhenUsed="1"/>
-    <w:lsdException w:name="List Number" w:semiHidden="1" w:unhideWhenUsed="1"/>
-    <w:lsdException w:name="List 2" w:semiHidden="1" w:unhideWhenUsed="1"/>
-    <w:lsdException w:name="List 3" w:semiHidden="1" w:unhideWhenUsed="1"/>
-    <w:lsdException w:name="List 4" w:semiHidden="1" w:unhideWhenUsed="1"/>
-    <w:lsdException w:name="List 5" w:semiHidden="1" w:unhideWhenUsed="1"/>
-    <w:lsdException w:name="List Bullet 2" w:semiHidden="1" w:unhideWhenUsed="1"/>
-    <w:lsdException w:name="List Bullet 3" w:semiHidden="1" w:unhideWhenUsed="1"/>
-    <w:lsdException w:name="List Bullet 4" w:semiHidden="1" w:unhideWhenUsed="1"/>
-    <w:lsdException w:name="List Bullet 5" w:semiHidden="1" w:unhideWhenUsed="1"/>
-    <w:lsdException w:name="List Number 2" w:semiHidden="1" w:unhideWhenUsed="1"/>
-    <w:lsdException w:name="List Number 3" w:semiHidden="1" w:unhideWhenUsed="1"/>
-    <w:lsdException w:name="List Number 4" w:semiHidden="1" w:unhideWhenUsed="1"/>
-    <w:lsdException w:name="List Number 5" w:semiHidden="1" w:unhideWhenUsed="1"/>
-    <w:lsdException w:name="Title" w:uiPriority="10" w:qFormat="1"/>
-    <w:lsdException w:name="Closing" w:semiHidden="1" w:unhideWhenUsed="1"/>
-    <w:lsdException w:name="Signature" w:semiHidden="1" w:unhideWhenUsed="1"/>
-    <w:lsdException w:name="Default Paragraph Font" w:semiHidden="1" w:uiPriority="1" w:unhideWhenUsed="1"/>
-    <w:lsdException w:name="Body Text" w:semiHidden="1" w:unhideWhenUsed="1"/>
-    <w:lsdException w:name="Body Text Indent" w:semiHidden="1" w:unhideWhenUsed="1"/>
-    <w:lsdException w:name="List Continue" w:semiHidden="1" w:unhideWhenUsed="1"/>
-    <w:lsdException w:name="List Continue 2" w:semiHidden="1" w:unhideWhenUsed="1"/>
-    <w:lsdException w:name="List Continue 3" w:semiHidden="1" w:unhideWhenUsed="1"/>
-    <w:lsdException w:name="List Continue 4" w:semiHidden="1" w:unhideWhenUsed="1"/>
-    <w:lsdException w:name="List Continue 5" w:semiHidden="1" w:unhideWhenUsed="1"/>
-    <w:lsdException w:name="Message Header" w:semiHidden="1" w:unhideWhenUsed="1"/>
-    <w:lsdException w:name="Subtitle" w:uiPriority="11" w:qFormat="1"/>
-    <w:lsdException w:name="Salutation" w:semiHidden="1" w:unhideWhenUsed="1"/>
-    <w:lsdException w:name="Date" w:semiHidden="1" w:unhideWhenUsed="1"/>
-    <w:lsdException w:name="Body Text First Indent" w:semiHidden="1" w:unhideWhenUsed="1"/>
-    <w:lsdException w:name="Body Text First Indent 2" w:semiHidden="1" w:unhideWhenUsed="1"/>
-    <w:lsdException w:name="Note Heading" w:semiHidden="1" w:unhideWhenUsed="1"/>
-    <w:lsdException w:name="Body Text 2" w:semiHidden="1" w:uiPriority="0" w:unhideWhenUsed="1"/>
-    <w:lsdException w:name="Body Text 3" w:semiHidden="1" w:unhideWhenUsed="1"/>
-    <w:lsdException w:name="Body Text Indent 2" w:semiHidden="1" w:unhideWhenUsed="1"/>
-    <w:lsdException w:name="Body Text Indent 3" w:semiHidden="1" w:unhideWhenUsed="1"/>
-    <w:lsdException w:name="Block Text" w:semiHidden="1" w:unhideWhenUsed="1"/>
-    <w:lsdException w:name="Hyperlink" w:semiHidden="1" w:unhideWhenUsed="1"/>
-    <w:lsdException w:name="FollowedHyperlink" w:semiHidden="1" w:unhideWhenUsed="1"/>
-    <w:lsdException w:name="Strong" w:uiPriority="22" w:qFormat="1"/>
-    <w:lsdException w:name="Emphasis" w:uiPriority="20" w:qFormat="1"/>
-    <w:lsdException w:name="Document Map" w:semiHidden="1" w:unhideWhenUsed="1"/>
-    <w:lsdException w:name="Plain Text" w:semiHidden="1" w:unhideWhenUsed="1"/>
-    <w:lsdException w:name="E-mail Signature" w:semiHidden="1" w:unhideWhenUsed="1"/>
-    <w:lsdException w:name="HTML Top of Form" w:semiHidden="1" w:unhideWhenUsed="1"/>
-    <w:lsdException w:name="HTML Bottom of Form" w:semiHidden="1" w:unhideWhenUsed="1"/>
-    <w:lsdException w:name="Normal (Web)" w:semiHidden="1" w:unhideWhenUsed="1"/>
-    <w:lsdException w:name="HTML Acronym" w:semiHidden="1" w:unhideWhenUsed="1"/>
-    <w:lsdException w:name="HTML Address" w:semiHidden="1" w:unhideWhenUsed="1"/>
-    <w:lsdException w:name="HTML Cite" w:semiHidden="1" w:unhideWhenUsed="1"/>
-    <w:lsdException w:name="HTML Code" w:semiHidden="1" w:unhideWhenUsed="1"/>
-    <w:lsdException w:name="HTML Definition" w:semiHidden="1" w:unhideWhenUsed="1"/>
-    <w:lsdException w:name="HTML Keyboard" w:semiHidden="1" w:unhideWhenUsed="1"/>
-    <w:lsdException w:name="HTML Preformatted" w:semiHidden="1" w:unhideWhenUsed="1"/>
-    <w:lsdException w:name="HTML Sample" w:semiHidden="1" w:unhideWhenUsed="1"/>
-    <w:lsdException w:name="HTML Typewriter" w:semiHidden="1" w:unhideWhenUsed="1"/>
-    <w:lsdException w:name="HTML Variable" w:semiHidden="1" w:unhideWhenUsed="1"/>
-    <w:lsdException w:name="Normal Table" w:semiHidden="1" w:unhideWhenUsed="1"/>
-    <w:lsdException w:name="annotation subject" w:semiHidden="1" w:unhideWhenUsed="1"/>
-    <w:lsdException w:name="No List" w:semiHidden="1" w:unhideWhenUsed="1"/>
-    <w:lsdException w:name="Outline List 1" w:semiHidden="1" w:unhideWhenUsed="1"/>
-    <w:lsdException w:name="Outline List 2" w:semiHidden="1" w:unhideWhenUsed="1"/>
-    <w:lsdException w:name="Outline List 3" w:semiHidden="1" w:unhideWhenUsed="1"/>
-    <w:lsdException w:name="Table Simple 1" w:semiHidden="1" w:unhideWhenUsed="1"/>
-    <w:lsdException w:name="Table Simple 2" w:semiHidden="1" w:unhideWhenUsed="1"/>
-    <w:lsdException w:name="Table Simple 3" w:semiHidden="1" w:unhideWhenUsed="1"/>
-    <w:lsdException w:name="Table Classic 1" w:semiHidden="1" w:unhideWhenUsed="1"/>
-    <w:lsdException w:name="Table Classic 2" w:semiHidden="1" w:unhideWhenUsed="1"/>
-    <w:lsdException w:name="Table Classic 3" w:semiHidden="1" w:unhideWhenUsed="1"/>
-    <w:lsdException w:name="Table Classic 4" w:semiHidden="1" w:unhideWhenUsed="1"/>
-    <w:lsdException w:name="Table Colorful 1" w:semiHidden="1" w:unhideWhenUsed="1"/>
-    <w:lsdException w:name="Table Colorful 2" w:semiHidden="1" w:unhideWhenUsed="1"/>
-    <w:lsdException w:name="Table Colorful 3" w:semiHidden="1" w:unhideWhenUsed="1"/>
-    <w:lsdException w:name="Table Columns 1" w:semiHidden="1" w:unhideWhenUsed="1"/>
-    <w:lsdException w:name="Table Columns 2" w:semiHidden="1" w:unhideWhenUsed="1"/>
-    <w:lsdException w:name="Table Columns 3" w:semiHidden="1" w:unhideWhenUsed="1"/>
-    <w:lsdException w:name="Table Columns 4" w:semiHidden="1" w:unhideWhenUsed="1"/>
-    <w:lsdException w:name="Table Columns 5" w:semiHidden="1" w:unhideWhenUsed="1"/>
-    <w:lsdException w:name="Table Grid 1" w:semiHidden="1" w:unhideWhenUsed="1"/>
-    <w:lsdException w:name="Table Grid 2" w:semiHidden="1" w:unhideWhenUsed="1"/>
-    <w:lsdException w:name="Table Grid 3" w:semiHidden="1" w:unhideWhenUsed="1"/>
-    <w:lsdException w:name="Table Grid 4" w:semiHidden="1" w:unhideWhenUsed="1"/>
-    <w:lsdException w:name="Table Grid 5" w:semiHidden="1" w:unhideWhenUsed="1"/>
-    <w:lsdException w:name="Table Grid 6" w:semiHidden="1" w:unhideWhenUsed="1"/>
-    <w:lsdException w:name="Table Grid 7" w:semiHidden="1" w:unhideWhenUsed="1"/>
-    <w:lsdException w:name="Table Grid 8" w:semiHidden="1" w:unhideWhenUsed="1"/>
-    <w:lsdException w:name="Table List 1" w:semiHidden="1" w:unhideWhenUsed="1"/>
-    <w:lsdException w:name="Table List 2" w:semiHidden="1" w:unhideWhenUsed="1"/>
-    <w:lsdException w:name="Table List 3" w:semiHidden="1" w:unhideWhenUsed="1"/>
-    <w:lsdException w:name="Table List 4" w:semiHidden="1" w:unhideWhenUsed="1"/>
-    <w:lsdException w:name="Table List 5" w:semiHidden="1" w:unhideWhenUsed="1"/>
-    <w:lsdException w:name="Table List 6" w:semiHidden="1" w:unhideWhenUsed="1"/>
-    <w:lsdException w:name="Table List 7" w:semiHidden="1" w:unhideWhenUsed="1"/>
-    <w:lsdException w:name="Table List 8" w:semiHidden="1" w:unhideWhenUsed="1"/>
-    <w:lsdException w:name="Table 3D effects 1" w:semiHidden="1" w:unhideWhenUsed="1"/>
-    <w:lsdException w:name="Table 3D effects 2" w:semiHidden="1" w:unhideWhenUsed="1"/>
-    <w:lsdException w:name="Table 3D effects 3" w:semiHidden="1" w:unhideWhenUsed="1"/>
-    <w:lsdException w:name="Table Contemporary" w:semiHidden="1" w:unhideWhenUsed="1"/>
-    <w:lsdException w:name="Table Elegant" w:semiHidden="1" w:unhideWhenUsed="1"/>
-    <w:lsdException w:name="Table Professional" w:semiHidden="1" w:unhideWhenUsed="1"/>
-    <w:lsdException w:name="Table Subtle 1" w:semiHidden="1" w:unhideWhenUsed="1"/>
-    <w:lsdException w:name="Table Subtle 2" w:semiHidden="1" w:unhideWhenUsed="1"/>
-    <w:lsdException w:name="Table Web 1" w:semiHidden="1" w:unhideWhenUsed="1"/>
-    <w:lsdException w:name="Table Web 2" w:semiHidden="1" w:unhideWhenUsed="1"/>
-    <w:lsdException w:name="Table Web 3" w:semiHidden="1" w:unhideWhenUsed="1"/>
-    <w:lsdException w:name="Balloon Text" w:semiHidden="1" w:unhideWhenUsed="1"/>
-    <w:lsdException w:name="Table Grid" w:uiPriority="59"/>
-    <w:lsdException w:name="Table Theme" w:semiHidden="1" w:unhideWhenUsed="1"/>
-    <w:lsdException w:name="Placeholder Text" w:semiHidden="1"/>
-    <w:lsdException w:name="No Spacing" w:uiPriority="1" w:qFormat="1"/>
-    <w:lsdException w:name="Light Shading" w:uiPriority="60"/>
-    <w:lsdException w:name="Light List" w:uiPriority="61"/>
-    <w:lsdException w:name="Light Grid" w:uiPriority="62"/>
-    <w:lsdException w:name="Medium Shading 1" w:uiPriority="63"/>
-    <w:lsdException w:name="Medium Shading 2" w:uiPriority="64"/>
-    <w:lsdException w:name="Medium List 1" w:uiPriority="65"/>
-    <w:lsdException w:name="Medium List 2" w:uiPriority="66"/>
-    <w:lsdException w:name="Medium Grid 1" w:uiPriority="67"/>
-    <w:lsdException w:name="Medium Grid 2" w:uiPriority="68"/>
-    <w:lsdException w:name="Medium Grid 3" w:uiPriority="69"/>
-    <w:lsdException w:name="Dark List" w:uiPriority="70"/>
-    <w:lsdException w:name="Colorful Shading" w:uiPriority="71"/>
-    <w:lsdException w:name="Colorful List" w:uiPriority="72"/>
-    <w:lsdException w:name="Colorful Grid" w:uiPriority="73"/>
-    <w:lsdException w:name="Light Shading Accent 1" w:uiPriority="60"/>
-    <w:lsdException w:name="Light List Accent 1" w:uiPriority="61"/>
-    <w:lsdException w:name="Light Grid Accent 1" w:uiPriority="62"/>
-    <w:lsdException w:name="Medium Shading 1 Accent 1" w:uiPriority="63"/>
-    <w:lsdException w:name="Medium Shading 2 Accent 1" w:uiPriority="64"/>
-    <w:lsdException w:name="Medium List 1 Accent 1" w:uiPriority="65"/>
-    <w:lsdException w:name="Revision" w:semiHidden="1"/>
-    <w:lsdException w:name="List Paragraph" w:uiPriority="34" w:qFormat="1"/>
-    <w:lsdException w:name="Quote" w:uiPriority="29" w:qFormat="1"/>
-    <w:lsdException w:name="Intense Quote" w:uiPriority="30" w:qFormat="1"/>
-    <w:lsdException w:name="Medium List 2 Accent 1" w:uiPriority="66"/>
-    <w:lsdException w:name="Medium Grid 1 Accent 1" w:uiPriority="67"/>
-    <w:lsdException w:name="Medium Grid 2 Accent 1" w:uiPriority="68"/>
-    <w:lsdException w:name="Medium Grid 3 Accent 1" w:uiPriority="69"/>
-    <w:lsdException w:name="Dark List Accent 1" w:uiPriority="70"/>
-    <w:lsdException w:name="Colorful Shading Accent 1" w:uiPriority="71"/>
-    <w:lsdException w:name="Colorful List Accent 1" w:uiPriority="72"/>
-    <w:lsdException w:name="Colorful Grid Accent 1" w:uiPriority="73"/>
-    <w:lsdException w:name="Light Shading Accent 2" w:uiPriority="60"/>
-    <w:lsdException w:name="Light List Accent 2" w:uiPriority="61"/>
-    <w:lsdException w:name="Light Grid Accent 2" w:uiPriority="62"/>
-    <w:lsdException w:name="Medium Shading 1 Accent 2" w:uiPriority="63"/>
-    <w:lsdException w:name="Medium Shading 2 Accent 2" w:uiPriority="64"/>
-    <w:lsdException w:name="Medium List 1 Accent 2" w:uiPriority="65"/>
-    <w:lsdException w:name="Medium List 2 Accent 2" w:uiPriority="66"/>
-    <w:lsdException w:name="Medium Grid 1 Accent 2" w:uiPriority="67"/>
-    <w:lsdException w:name="Medium Grid 2 Accent 2" w:uiPriority="68"/>
-    <w:lsdException w:name="Medium Grid 3 Accent 2" w:uiPriority="69"/>
-    <w:lsdException w:name="Dark List Accent 2" w:uiPriority="70"/>
-    <w:lsdException w:name="Colorful Shading Accent 2" w:uiPriority="71"/>
-    <w:lsdException w:name="Colorful List Accent 2" w:uiPriority="72"/>
-    <w:lsdException w:name="Colorful Grid Accent 2" w:uiPriority="73"/>
-    <w:lsdException w:name="Light Shading Accent 3" w:uiPriority="60"/>
-    <w:lsdException w:name="Light List Accent 3" w:uiPriority="61"/>
-    <w:lsdException w:name="Light Grid Accent 3" w:uiPriority="62"/>
-    <w:lsdException w:name="Medium Shading 1 Accent 3" w:uiPriority="63"/>
-    <w:lsdException w:name="Medium Shading 2 Accent 3" w:uiPriority="64"/>
-    <w:lsdException w:name="Medium List 1 Accent 3" w:uiPriority="65"/>
-    <w:lsdException w:name="Medium List 2 Accent 3" w:uiPriority="66"/>
-    <w:lsdException w:name="Medium Grid 1 Accent 3" w:uiPriority="67"/>
-    <w:lsdException w:name="Medium Grid 2 Accent 3" w:uiPriority="68"/>
-    <w:lsdException w:name="Medium Grid 3 Accent 3" w:uiPriority="69"/>
-    <w:lsdException w:name="Dark List Accent 3" w:uiPriority="70"/>
-    <w:lsdException w:name="Colorful Shading Accent 3" w:uiPriority="71"/>
-    <w:lsdException w:name="Colorful List Accent 3" w:uiPriority="72"/>
-    <w:lsdException w:name="Colorful Grid Accent 3" w:uiPriority="73"/>
-    <w:lsdException w:name="Light Shading Accent 4" w:uiPriority="60"/>
-    <w:lsdException w:name="Light List Accent 4" w:uiPriority="61"/>
-    <w:lsdException w:name="Light Grid Accent 4" w:uiPriority="62"/>
-    <w:lsdException w:name="Medium Shading 1 Accent 4" w:uiPriority="63"/>
-    <w:lsdException w:name="Medium Shading 2 Accent 4" w:uiPriority="64"/>
-    <w:lsdException w:name="Medium List 1 Accent 4" w:uiPriority="65"/>
-    <w:lsdException w:name="Medium List 2 Accent 4" w:uiPriority="66"/>
-    <w:lsdException w:name="Medium Grid 1 Accent 4" w:uiPriority="67"/>
-    <w:lsdException w:name="Medium Grid 2 Accent 4" w:uiPriority="68"/>
-    <w:lsdException w:name="Medium Grid 3 Accent 4" w:uiPriority="69"/>
-    <w:lsdException w:name="Dark List Accent 4" w:uiPriority="70"/>
-    <w:lsdException w:name="Colorful Shading Accent 4" w:uiPriority="71"/>
-    <w:lsdException w:name="Colorful List Accent 4" w:uiPriority="72"/>
-    <w:lsdException w:name="Colorful Grid Accent 4" w:uiPriority="73"/>
-    <w:lsdException w:name="Light Shading Accent 5" w:uiPriority="60"/>
-    <w:lsdException w:name="Light List Accent 5" w:uiPriority="61"/>
-    <w:lsdException w:name="Light Grid Accent 5" w:uiPriority="62"/>
-    <w:lsdException w:name="Medium Shading 1 Accent 5" w:uiPriority="63"/>
-    <w:lsdException w:name="Medium Shading 2 Accent 5" w:uiPriority="64"/>
-    <w:lsdException w:name="Medium List 1 Accent 5" w:uiPriority="65"/>
-    <w:lsdException w:name="Medium List 2 Accent 5" w:uiPriority="66"/>
-    <w:lsdException w:name="Medium Grid 1 Accent 5" w:uiPriority="67"/>
-    <w:lsdException w:name="Medium Grid 2 Accent 5" w:uiPriority="68"/>
-    <w:lsdException w:name="Medium Grid 3 Accent 5" w:uiPriority="69"/>
-    <w:lsdException w:name="Dark List Accent 5" w:uiPriority="70"/>
-    <w:lsdException w:name="Colorful Shading Accent 5" w:uiPriority="71"/>
-    <w:lsdException w:name="Colorful List Accent 5" w:uiPriority="72"/>
-    <w:lsdException w:name="Colorful Grid Accent 5" w:uiPriority="73"/>
-    <w:lsdException w:name="Light Shading Accent 6" w:uiPriority="60"/>
-    <w:lsdException w:name="Light List Accent 6" w:uiPriority="61"/>
-    <w:lsdException w:name="Light Grid Accent 6" w:uiPriority="62"/>
-    <w:lsdException w:name="Medium Shading 1 Accent 6" w:uiPriority="63"/>
-    <w:lsdException w:name="Medium Shading 2 Accent 6" w:uiPriority="64"/>
-    <w:lsdException w:name="Medium List 1 Accent 6" w:uiPriority="65"/>
-    <w:lsdException w:name="Medium List 2 Accent 6" w:uiPriority="66"/>
-    <w:lsdException w:name="Medium Grid 1 Accent 6" w:uiPriority="67"/>
-    <w:lsdException w:name="Medium Grid 2 Accent 6" w:uiPriority="68"/>
-    <w:lsdException w:name="Medium Grid 3 Accent 6" w:uiPriority="69"/>
-    <w:lsdException w:name="Dark List Accent 6" w:uiPriority="70"/>
-    <w:lsdException w:name="Colorful Shading Accent 6" w:uiPriority="71"/>
-    <w:lsdException w:name="Colorful List Accent 6" w:uiPriority="72"/>
-    <w:lsdException w:name="Colorful Grid Accent 6" w:uiPriority="73"/>
-    <w:lsdException w:name="Subtle Emphasis" w:uiPriority="19" w:qFormat="1"/>
-    <w:lsdException w:name="Intense Emphasis" w:uiPriority="21" w:qFormat="1"/>
-    <w:lsdException w:name="Subtle Reference" w:uiPriority="31" w:qFormat="1"/>
-    <w:lsdException w:name="Intense Reference" w:uiPriority="32" w:qFormat="1"/>
-    <w:lsdException w:name="Book Title" w:uiPriority="33" w:qFormat="1"/>
-    <w:lsdException w:name="Bibliography" w:semiHidden="1" w:uiPriority="37" w:unhideWhenUsed="1"/>
-    <w:lsdException w:name="TOC Heading" w:semiHidden="1" w:uiPriority="39" w:unhideWhenUsed="1" w:qFormat="1"/>
-    <w:lsdException w:name="Plain Table 1" w:uiPriority="41"/>
-    <w:lsdException w:name="Plain Table 2" w:uiPriority="42"/>
-    <w:lsdException w:name="Plain Table 3" w:uiPriority="43"/>
-    <w:lsdException w:name="Plain Table 4" w:uiPriority="44"/>
-    <w:lsdException w:name="Plain Table 5" w:uiPriority="45"/>
-    <w:lsdException w:name="Grid Table Light" w:uiPriority="40"/>
-    <w:lsdException w:name="Grid Table 1 Light" w:uiPriority="46"/>
-    <w:lsdException w:name="Grid Table 2" w:uiPriority="47"/>
-    <w:lsdException w:name="Grid Table 3" w:uiPriority="48"/>
-    <w:lsdException w:name="Grid Table 4" w:uiPriority="49"/>
-    <w:lsdException w:name="Grid Table 5 Dark" w:uiPriority="50"/>
-    <w:lsdException w:name="Grid Table 6 Colorful" w:uiPriority="51"/>
-    <w:lsdException w:name="Grid Table 7 Colorful" w:uiPriority="52"/>
-    <w:lsdException w:name="Grid Table 1 Light Accent 1" w:uiPriority="46"/>
-    <w:lsdException w:name="Grid Table 2 Accent 1" w:uiPriority="47"/>
-    <w:lsdException w:name="Grid Table 3 Accent 1" w:uiPriority="48"/>
-    <w:lsdException w:name="Grid Table 4 Accent 1" w:uiPriority="49"/>
-    <w:lsdException w:name="Grid Table 5 Dark Accent 1" w:uiPriority="50"/>
-    <w:lsdException w:name="Grid Table 6 Colorful Accent 1" w:uiPriority="51"/>
-    <w:lsdException w:name="Grid Table 7 Colorful Accent 1" w:uiPriority="52"/>
-    <w:lsdException w:name="Grid Table 1 Light Accent 2" w:uiPriority="46"/>
-    <w:lsdException w:name="Grid Table 2 Accent 2" w:uiPriority="47"/>
-    <w:lsdException w:name="Grid Table 3 Accent 2" w:uiPriority="48"/>
-    <w:lsdException w:name="Grid Table 4 Accent 2" w:uiPriority="49"/>
-    <w:lsdException w:name="Grid Table 5 Dark Accent 2" w:uiPriority="50"/>
-    <w:lsdException w:name="Grid Table 6 Colorful Accent 2" w:uiPriority="51"/>
-    <w:lsdException w:name="Grid Table 7 Colorful Accent 2" w:uiPriority="52"/>
-    <w:lsdException w:name="Grid Table 1 Light Accent 3" w:uiPriority="46"/>
-    <w:lsdException w:name="Grid Table 2 Accent 3" w:uiPriority="47"/>
-    <w:lsdException w:name="Grid Table 3 Accent 3" w:uiPriority="48"/>
-    <w:lsdException w:name="Grid Table 4 Accent 3" w:uiPriority="49"/>
-    <w:lsdException w:name="Grid Table 5 Dark Accent 3" w:uiPriority="50"/>
-    <w:lsdException w:name="Grid Table 6 Colorful Accent 3" w:uiPriority="51"/>
-    <w:lsdException w:name="Grid Table 7 Colorful Accent 3" w:uiPriority="52"/>
-    <w:lsdException w:name="Grid Table 1 Light Accent 4" w:uiPriority="46"/>
-    <w:lsdException w:name="Grid Table 2 Accent 4" w:uiPriority="47"/>
-    <w:lsdException w:name="Grid Table 3 Accent 4" w:uiPriority="48"/>
-    <w:lsdException w:name="Grid Table 4 Accent 4" w:uiPriority="49"/>
-    <w:lsdException w:name="Grid Table 5 Dark Accent 4" w:uiPriority="50"/>
-    <w:lsdException w:name="Grid Table 6 Colorful Accent 4" w:uiPriority="51"/>
-    <w:lsdException w:name="Grid Table 7 Colorful Accent 4" w:uiPriority="52"/>
-    <w:lsdException w:name="Grid Table 1 Light Accent 5" w:uiPriority="46"/>
-    <w:lsdException w:name="Grid Table 2 Accent 5" w:uiPriority="47"/>
-    <w:lsdException w:name="Grid Table 3 Accent 5" w:uiPriority="48"/>
-    <w:lsdException w:name="Grid Table 4 Accent 5" w:uiPriority="49"/>
-    <w:lsdException w:name="Grid Table 5 Dark Accent 5" w:uiPriority="50"/>
-    <w:lsdException w:name="Grid Table 6 Colorful Accent 5" w:uiPriority="51"/>
-    <w:lsdException w:name="Grid Table 7 Colorful Accent 5" w:uiPriority="52"/>
-    <w:lsdException w:name="Grid Table 1 Light Accent 6" w:uiPriority="46"/>
-    <w:lsdException w:name="Grid Table 2 Accent 6" w:uiPriority="47"/>
-    <w:lsdException w:name="Grid Table 3 Accent 6" w:uiPriority="48"/>
-    <w:lsdException w:name="Grid Table 4 Accent 6" w:uiPriority="49"/>
-    <w:lsdException w:name="Grid Table 5 Dark Accent 6" w:uiPriority="50"/>
-    <w:lsdException w:name="Grid Table 6 Colorful Accent 6" w:uiPriority="51"/>
-    <w:lsdException w:name="Grid Table 7 Colorful Accent 6" w:uiPriority="52"/>
-    <w:lsdException w:name="List Table 1 Light" w:uiPriority="46"/>
-    <w:lsdException w:name="List Table 2" w:uiPriority="47"/>
-    <w:lsdException w:name="List Table 3" w:uiPriority="48"/>
-    <w:lsdException w:name="List Table 4" w:uiPriority="49"/>
-    <w:lsdException w:name="List Table 5 Dark" w:uiPriority="50"/>
-    <w:lsdException w:name="List Table 6 Colorful" w:uiPriority="51"/>
-    <w:lsdException w:name="List Table 7 Colorful" w:uiPriority="52"/>
-    <w:lsdException w:name="List Table 1 Light Accent 1" w:uiPriority="46"/>
-    <w:lsdException w:name="List Table 2 Accent 1" w:uiPriority="47"/>
-    <w:lsdException w:name="List Table 3 Accent 1" w:uiPriority="48"/>
-    <w:lsdException w:name="List Table 4 Accent 1" w:uiPriority="49"/>
-    <w:lsdException w:name="List Table 5 Dark Accent 1" w:uiPriority="50"/>
-    <w:lsdException w:name="List Table 6 Colorful Accent 1" w:uiPriority="51"/>
-    <w:lsdException w:name="List Table 7 Colorful Accent 1" w:uiPriority="52"/>
-    <w:lsdException w:name="List Table 1 Light Accent 2" w:uiPriority="46"/>
-    <w:lsdException w:name="List Table 2 Accent 2" w:uiPriority="47"/>
-    <w:lsdException w:name="List Table 3 Accent 2" w:uiPriority="48"/>
-    <w:lsdException w:name="List Table 4 Accent 2" w:uiPriority="49"/>
-    <w:lsdException w:name="List Table 5 Dark Accent 2" w:uiPriority="50"/>
-    <w:lsdException w:name="List Table 6 Colorful Accent 2" w:uiPriority="51"/>
-    <w:lsdException w:name="List Table 7 Colorful Accent 2" w:uiPriority="52"/>
-    <w:lsdException w:name="List Table 1 Light Accent 3" w:uiPriority="46"/>
-    <w:lsdException w:name="List Table 2 Accent 3" w:uiPriority="47"/>
-    <w:lsdException w:name="List Table 3 Accent 3" w:uiPriority="48"/>
-    <w:lsdException w:name="List Table 4 Accent 3" w:uiPriority="49"/>
-    <w:lsdException w:name="List Table 5 Dark Accent 3" w:uiPriority="50"/>
-    <w:lsdException w:name="List Table 6 Colorful Accent 3" w:uiPriority="51"/>
-    <w:lsdException w:name="List Table 7 Colorful Accent 3" w:uiPriority="52"/>
-    <w:lsdException w:name="List Table 1 Light Accent 4" w:uiPriority="46"/>
-    <w:lsdException w:name="List Table 2 Accent 4" w:uiPriority="47"/>
-    <w:lsdException w:name="List Table 3 Accent 4" w:uiPriority="48"/>
-    <w:lsdException w:name="List Table 4 Accent 4" w:uiPriority="49"/>
-    <w:lsdException w:name="List Table 5 Dark Accent 4" w:uiPriority="50"/>
-    <w:lsdException w:name="List Table 6 Colorful Accent 4" w:uiPriority="51"/>
-    <w:lsdException w:name="List Table 7 Colorful Accent 4" w:uiPriority="52"/>
-    <w:lsdException w:name="List Table 1 Light Accent 5" w:uiPriority="46"/>
-    <w:lsdException w:name="List Table 2 Accent 5" w:uiPriority="47"/>
-    <w:lsdException w:name="List Table 3 Accent 5" w:uiPriority="48"/>
-    <w:lsdException w:name="List Table 4 Accent 5" w:uiPriority="49"/>
-    <w:lsdException w:name="List Table 5 Dark Accent 5" w:uiPriority="50"/>
-    <w:lsdException w:name="List Table 6 Colorful Accent 5" w:uiPriority="51"/>
-    <w:lsdException w:name="List Table 7 Colorful Accent 5" w:uiPriority="52"/>
-    <w:lsdException w:name="List Table 1 Light Accent 6" w:uiPriority="46"/>
-    <w:lsdException w:name="List Table 2 Accent 6" w:uiPriority="47"/>
-    <w:lsdException w:name="List Table 3 Accent 6" w:uiPriority="48"/>
-    <w:lsdException w:name="List Table 4 Accent 6" w:uiPriority="49"/>
-    <w:lsdException w:name="List Table 5 Dark Accent 6" w:uiPriority="50"/>
-    <w:lsdException w:name="List Table 6 Colorful Accent 6" w:uiPriority="51"/>
-    <w:lsdException w:name="List Table 7 Colorful Accent 6" w:uiPriority="52"/>
-    <w:lsdException w:name="Mention" w:semiHidden="1" w:unhideWhenUsed="1"/>
-    <w:lsdException w:name="Smart Hyperlink" w:semiHidden="1" w:unhideWhenUsed="1"/>
-    <w:lsdException w:name="Hashtag" w:semiHidden="1" w:unhideWhenUsed="1"/>
-    <w:lsdException w:name="Unresolved Mention" w:semiHidden="1" w:unhideWhenUsed="1"/>
-    <w:lsdException w:name="Smart Link" w:semiHidden="1" w:unhideWhenUsed="1"/>
+  <w:latentStyles w:defLockedState="0" w:defUIPriority="99" w:defSemiHidden="1" w:defUnhideWhenUsed="1" w:defQFormat="0" w:count="267">
+    <w:lsdException w:name="Normal" w:semiHidden="0" w:uiPriority="0" w:unhideWhenUsed="0" w:qFormat="1"/>
+    <w:lsdException w:name="heading 1" w:semiHidden="0" w:uiPriority="9" w:unhideWhenUsed="0" w:qFormat="1"/>
+    <w:lsdException w:name="heading 2" w:uiPriority="9" w:qFormat="1"/>
+    <w:lsdException w:name="heading 3" w:uiPriority="9" w:qFormat="1"/>
+    <w:lsdException w:name="heading 4" w:uiPriority="9" w:qFormat="1"/>
+    <w:lsdException w:name="heading 5" w:uiPriority="9" w:qFormat="1"/>
+    <w:lsdException w:name="heading 6" w:uiPriority="9" w:qFormat="1"/>
+    <w:lsdException w:name="heading 7" w:uiPriority="9" w:qFormat="1"/>
+    <w:lsdException w:name="heading 8" w:uiPriority="9" w:qFormat="1"/>
+    <w:lsdException w:name="heading 9" w:uiPriority="9" w:qFormat="1"/>
+    <w:lsdException w:name="toc 1" w:uiPriority="39"/>
+    <w:lsdException w:name="toc 2" w:uiPriority="39"/>
+    <w:lsdException w:name="toc 3" w:uiPriority="39"/>
+    <w:lsdException w:name="toc 4" w:uiPriority="39"/>
+    <w:lsdException w:name="toc 5" w:uiPriority="39"/>
+    <w:lsdException w:name="toc 6" w:uiPriority="39"/>
+    <w:lsdException w:name="toc 7" w:uiPriority="39"/>
+    <w:lsdException w:name="toc 8" w:uiPriority="39"/>
+    <w:lsdException w:name="toc 9" w:uiPriority="39"/>
+    <w:lsdException w:name="caption" w:uiPriority="35" w:qFormat="1"/>
+    <w:lsdException w:name="Title" w:semiHidden="0" w:uiPriority="10" w:unhideWhenUsed="0" w:qFormat="1"/>
+    <w:lsdException w:name="Default Paragraph Font" w:uiPriority="1"/>
+    <w:lsdException w:name="Subtitle" w:semiHidden="0" w:uiPriority="11" w:unhideWhenUsed="0" w:qFormat="1"/>
+    <w:lsdException w:name="Body Text 2" w:uiPriority="0"/>
+    <w:lsdException w:name="Strong" w:semiHidden="0" w:uiPriority="22" w:unhideWhenUsed="0" w:qFormat="1"/>
+    <w:lsdException w:name="Emphasis" w:semiHidden="0" w:uiPriority="20" w:unhideWhenUsed="0" w:qFormat="1"/>
+    <w:lsdException w:name="Table Grid" w:semiHidden="0" w:uiPriority="59" w:unhideWhenUsed="0"/>
+    <w:lsdException w:name="Placeholder Text" w:unhideWhenUsed="0"/>
+    <w:lsdException w:name="No Spacing" w:semiHidden="0" w:uiPriority="1" w:unhideWhenUsed="0" w:qFormat="1"/>
+    <w:lsdException w:name="Light Shading" w:semiHidden="0" w:uiPriority="60" w:unhideWhenUsed="0"/>
+    <w:lsdException w:name="Light List" w:semiHidden="0" w:uiPriority="61" w:unhideWhenUsed="0"/>
+    <w:lsdException w:name="Light Grid" w:semiHidden="0" w:uiPriority="62" w:unhideWhenUsed="0"/>
+    <w:lsdException w:name="Medium Shading 1" w:semiHidden="0" w:uiPriority="63" w:unhideWhenUsed="0"/>
+    <w:lsdException w:name="Medium Shading 2" w:semiHidden="0" w:uiPriority="64" w:unhideWhenUsed="0"/>
+    <w:lsdException w:name="Medium List 1" w:semiHidden="0" w:uiPriority="65" w:unhideWhenUsed="0"/>
+    <w:lsdException w:name="Medium List 2" w:semiHidden="0" w:uiPriority="66" w:unhideWhenUsed="0"/>
+    <w:lsdException w:name="Medium Grid 1" w:semiHidden="0" w:uiPriority="67" w:unhideWhenUsed="0"/>
+    <w:lsdException w:name="Medium Grid 2" w:semiHidden="0" w:uiPriority="68" w:unhideWhenUsed="0"/>
+    <w:lsdException w:name="Medium Grid 3" w:semiHidden="0" w:uiPriority="69" w:unhideWhenUsed="0"/>
+    <w:lsdException w:name="Dark List" w:semiHidden="0" w:uiPriority="70" w:unhideWhenUsed="0"/>
+    <w:lsdException w:name="Colorful Shading" w:semiHidden="0" w:uiPriority="71" w:unhideWhenUsed="0"/>
+    <w:lsdException w:name="Colorful List" w:semiHidden="0" w:uiPriority="72" w:unhideWhenUsed="0"/>
+    <w:lsdException w:name="Colorful Grid" w:semiHidden="0" w:uiPriority="73" w:unhideWhenUsed="0"/>
+    <w:lsdException w:name="Light Shading Accent 1" w:semiHidden="0" w:uiPriority="60" w:unhideWhenUsed="0"/>
+    <w:lsdException w:name="Light List Accent 1" w:semiHidden="0" w:uiPriority="61" w:unhideWhenUsed="0"/>
+    <w:lsdException w:name="Light Grid Accent 1" w:semiHidden="0" w:uiPriority="62" w:unhideWhenUsed="0"/>
+    <w:lsdException w:name="Medium Shading 1 Accent 1" w:semiHidden="0" w:uiPriority="63" w:unhideWhenUsed="0"/>
+    <w:lsdException w:name="Medium Shading 2 Accent 1" w:semiHidden="0" w:uiPriority="64" w:unhideWhenUsed="0"/>
+    <w:lsdException w:name="Medium List 1 Accent 1" w:semiHidden="0" w:uiPriority="65" w:unhideWhenUsed="0"/>
+    <w:lsdException w:name="Revision" w:unhideWhenUsed="0"/>
+    <w:lsdException w:name="List Paragraph" w:semiHidden="0" w:uiPriority="34" w:unhideWhenUsed="0" w:qFormat="1"/>
+    <w:lsdException w:name="Quote" w:semiHidden="0" w:uiPriority="29" w:unhideWhenUsed="0" w:qFormat="1"/>
+    <w:lsdException w:name="Intense Quote" w:semiHidden="0" w:uiPriority="30" w:unhideWhenUsed="0" w:qFormat="1"/>
+    <w:lsdException w:name="Medium List 2 Accent 1" w:semiHidden="0" w:uiPriority="66" w:unhideWhenUsed="0"/>
+    <w:lsdException w:name="Medium Grid 1 Accent 1" w:semiHidden="0" w:uiPriority="67" w:unhideWhenUsed="0"/>
+    <w:lsdException w:name="Medium Grid 2 Accent 1" w:semiHidden="0" w:uiPriority="68" w:unhideWhenUsed="0"/>
+    <w:lsdException w:name="Medium Grid 3 Accent 1" w:semiHidden="0" w:uiPriority="69" w:unhideWhenUsed="0"/>
+    <w:lsdException w:name="Dark List Accent 1" w:semiHidden="0" w:uiPriority="70" w:unhideWhenUsed="0"/>
+    <w:lsdException w:name="Colorful Shading Accent 1" w:semiHidden="0" w:uiPriority="71" w:unhideWhenUsed="0"/>
+    <w:lsdException w:name="Colorful List Accent 1" w:semiHidden="0" w:uiPriority="72" w:unhideWhenUsed="0"/>
+    <w:lsdException w:name="Colorful Grid Accent 1" w:semiHidden="0" w:uiPriority="73" w:unhideWhenUsed="0"/>
+    <w:lsdException w:name="Light Shading Accent 2" w:semiHidden="0" w:uiPriority="60" w:unhideWhenUsed="0"/>
+    <w:lsdException w:name="Light List Accent 2" w:semiHidden="0" w:uiPriority="61" w:unhideWhenUsed="0"/>
+    <w:lsdException w:name="Light Grid Accent 2" w:semiHidden="0" w:uiPriority="62" w:unhideWhenUsed="0"/>
+    <w:lsdException w:name="Medium Shading 1 Accent 2" w:semiHidden="0" w:uiPriority="63" w:unhideWhenUsed="0"/>
+    <w:lsdException w:name="Medium Shading 2 Accent 2" w:semiHidden="0" w:uiPriority="64" w:unhideWhenUsed="0"/>
+    <w:lsdException w:name="Medium List 1 Accent 2" w:semiHidden="0" w:uiPriority="65" w:unhideWhenUsed="0"/>
+    <w:lsdException w:name="Medium List 2 Accent 2" w:semiHidden="0" w:uiPriority="66" w:unhideWhenUsed="0"/>
+    <w:lsdException w:name="Medium Grid 1 Accent 2" w:semiHidden="0" w:uiPriority="67" w:unhideWhenUsed="0"/>
+    <w:lsdException w:name="Medium Grid 2 Accent 2" w:semiHidden="0" w:uiPriority="68" w:unhideWhenUsed="0"/>
+    <w:lsdException w:name="Medium Grid 3 Accent 2" w:semiHidden="0" w:uiPriority="69" w:unhideWhenUsed="0"/>
+    <w:lsdException w:name="Dark List Accent 2" w:semiHidden="0" w:uiPriority="70" w:unhideWhenUsed="0"/>
+    <w:lsdException w:name="Colorful Shading Accent 2" w:semiHidden="0" w:uiPriority="71" w:unhideWhenUsed="0"/>
+    <w:lsdException w:name="Colorful List Accent 2" w:semiHidden="0" w:uiPriority="72" w:unhideWhenUsed="0"/>
+    <w:lsdException w:name="Colorful Grid Accent 2" w:semiHidden="0" w:uiPriority="73" w:unhideWhenUsed="0"/>
+    <w:lsdException w:name="Light Shading Accent 3" w:semiHidden="0" w:uiPriority="60" w:unhideWhenUsed="0"/>
+    <w:lsdException w:name="Light List Accent 3" w:semiHidden="0" w:uiPriority="61" w:unhideWhenUsed="0"/>
+    <w:lsdException w:name="Light Grid Accent 3" w:semiHidden="0" w:uiPriority="62" w:unhideWhenUsed="0"/>
+    <w:lsdException w:name="Medium Shading 1 Accent 3" w:semiHidden="0" w:uiPriority="63" w:unhideWhenUsed="0"/>
+    <w:lsdException w:name="Medium Shading 2 Accent 3" w:semiHidden="0" w:uiPriority="64" w:unhideWhenUsed="0"/>
+    <w:lsdException w:name="Medium List 1 Accent 3" w:semiHidden="0" w:uiPriority="65" w:unhideWhenUsed="0"/>
+    <w:lsdException w:name="Medium List 2 Accent 3" w:semiHidden="0" w:uiPriority="66" w:unhideWhenUsed="0"/>
+    <w:lsdException w:name="Medium Grid 1 Accent 3" w:semiHidden="0" w:uiPriority="67" w:unhideWhenUsed="0"/>
+    <w:lsdException w:name="Medium Grid 2 Accent 3" w:semiHidden="0" w:uiPriority="68" w:unhideWhenUsed="0"/>
+    <w:lsdException w:name="Medium Grid 3 Accent 3" w:semiHidden="0" w:uiPriority="69" w:unhideWhenUsed="0"/>
+    <w:lsdException w:name="Dark List Accent 3" w:semiHidden="0" w:uiPriority="70" w:unhideWhenUsed="0"/>
+    <w:lsdException w:name="Colorful Shading Accent 3" w:semiHidden="0" w:uiPriority="71" w:unhideWhenUsed="0"/>
+    <w:lsdException w:name="Colorful List Accent 3" w:semiHidden="0" w:uiPriority="72" w:unhideWhenUsed="0"/>
+    <w:lsdException w:name="Colorful Grid Accent 3" w:semiHidden="0" w:uiPriority="73" w:unhideWhenUsed="0"/>
+    <w:lsdException w:name="Light Shading Accent 4" w:semiHidden="0" w:uiPriority="60" w:unhideWhenUsed="0"/>
+    <w:lsdException w:name="Light List Accent 4" w:semiHidden="0" w:uiPriority="61" w:unhideWhenUsed="0"/>
+    <w:lsdException w:name="Light Grid Accent 4" w:semiHidden="0" w:uiPriority="62" w:unhideWhenUsed="0"/>
+    <w:lsdException w:name="Medium Shading 1 Accent 4" w:semiHidden="0" w:uiPriority="63" w:unhideWhenUsed="0"/>
+    <w:lsdException w:name="Medium Shading 2 Accent 4" w:semiHidden="0" w:uiPriority="64" w:unhideWhenUsed="0"/>
+    <w:lsdException w:name="Medium List 1 Accent 4" w:semiHidden="0" w:uiPriority="65" w:unhideWhenUsed="0"/>
+    <w:lsdException w:name="Medium List 2 Accent 4" w:semiHidden="0" w:uiPriority="66" w:unhideWhenUsed="0"/>
+    <w:lsdException w:name="Medium Grid 1 Accent 4" w:semiHidden="0" w:uiPriority="67" w:unhideWhenUsed="0"/>
+    <w:lsdException w:name="Medium Grid 2 Accent 4" w:semiHidden="0" w:uiPriority="68" w:unhideWhenUsed="0"/>
+    <w:lsdException w:name="Medium Grid 3 Accent 4" w:semiHidden="0" w:uiPriority="69" w:unhideWhenUsed="0"/>
+    <w:lsdException w:name="Dark List Accent 4" w:semiHidden="0" w:uiPriority="70" w:unhideWhenUsed="0"/>
+    <w:lsdException w:name="Colorful Shading Accent 4" w:semiHidden="0" w:uiPriority="71" w:unhideWhenUsed="0"/>
+    <w:lsdException w:name="Colorful List Accent 4" w:semiHidden="0" w:uiPriority="72" w:unhideWhenUsed="0"/>
+    <w:lsdException w:name="Colorful Grid Accent 4" w:semiHidden="0" w:uiPriority="73" w:unhideWhenUsed="0"/>
+    <w:lsdException w:name="Light Shading Accent 5" w:semiHidden="0" w:uiPriority="60" w:unhideWhenUsed="0"/>
+    <w:lsdException w:name="Light List Accent 5" w:semiHidden="0" w:uiPriority="61" w:unhideWhenUsed="0"/>
+    <w:lsdException w:name="Light Grid Accent 5" w:semiHidden="0" w:uiPriority="62" w:unhideWhenUsed="0"/>
+    <w:lsdException w:name="Medium Shading 1 Accent 5" w:semiHidden="0" w:uiPriority="63" w:unhideWhenUsed="0"/>
+    <w:lsdException w:name="Medium Shading 2 Accent 5" w:semiHidden="0" w:uiPriority="64" w:unhideWhenUsed="0"/>
+    <w:lsdException w:name="Medium List 1 Accent 5" w:semiHidden="0" w:uiPriority="65" w:unhideWhenUsed="0"/>
+    <w:lsdException w:name="Medium List 2 Accent 5" w:semiHidden="0" w:uiPriority="66" w:unhideWhenUsed="0"/>
+    <w:lsdException w:name="Medium Grid 1 Accent 5" w:semiHidden="0" w:uiPriority="67" w:unhideWhenUsed="0"/>
+    <w:lsdException w:name="Medium Grid 2 Accent 5" w:semiHidden="0" w:uiPriority="68" w:unhideWhenUsed="0"/>
+    <w:lsdException w:name="Medium Grid 3 Accent 5" w:semiHidden="0" w:uiPriority="69" w:unhideWhenUsed="0"/>
+    <w:lsdException w:name="Dark List Accent 5" w:semiHidden="0" w:uiPriority="70" w:unhideWhenUsed="0"/>
+    <w:lsdException w:name="Colorful Shading Accent 5" w:semiHidden="0" w:uiPriority="71" w:unhideWhenUsed="0"/>
+    <w:lsdException w:name="Colorful List Accent 5" w:semiHidden="0" w:uiPriority="72" w:unhideWhenUsed="0"/>
+    <w:lsdException w:name="Colorful Grid Accent 5" w:semiHidden="0" w:uiPriority="73" w:unhideWhenUsed="0"/>
+    <w:lsdException w:name="Light Shading Accent 6" w:semiHidden="0" w:uiPriority="60" w:unhideWhenUsed="0"/>
+    <w:lsdException w:name="Light List Accent 6" w:semiHidden="0" w:uiPriority="61" w:unhideWhenUsed="0"/>
+    <w:lsdException w:name="Light Grid Accent 6" w:semiHidden="0" w:uiPriority="62" w:unhideWhenUsed="0"/>
+    <w:lsdException w:name="Medium Shading 1 Accent 6" w:semiHidden="0" w:uiPriority="63" w:unhideWhenUsed="0"/>
+    <w:lsdException w:name="Medium Shading 2 Accent 6" w:semiHidden="0" w:uiPriority="64" w:unhideWhenUsed="0"/>
+    <w:lsdException w:name="Medium List 1 Accent 6" w:semiHidden="0" w:uiPriority="65" w:unhideWhenUsed="0"/>
+    <w:lsdException w:name="Medium List 2 Accent 6" w:semiHidden="0" w:uiPriority="66" w:unhideWhenUsed="0"/>
+    <w:lsdException w:name="Medium Grid 1 Accent 6" w:semiHidden="0" w:uiPriority="67" w:unhideWhenUsed="0"/>
+    <w:lsdException w:name="Medium Grid 2 Accent 6" w:semiHidden="0" w:uiPriority="68" w:unhideWhenUsed="0"/>
+    <w:lsdException w:name="Medium Grid 3 Accent 6" w:semiHidden="0" w:uiPriority="69" w:unhideWhenUsed="0"/>
+    <w:lsdException w:name="Dark List Accent 6" w:semiHidden="0" w:uiPriority="70" w:unhideWhenUsed="0"/>
+    <w:lsdException w:name="Colorful Shading Accent 6" w:semiHidden="0" w:uiPriority="71" w:unhideWhenUsed="0"/>
+    <w:lsdException w:name="Colorful List Accent 6" w:semiHidden="0" w:uiPriority="72" w:unhideWhenUsed="0"/>
+    <w:lsdException w:name="Colorful Grid Accent 6" w:semiHidden="0" w:uiPriority="73" w:unhideWhenUsed="0"/>
+    <w:lsdException w:name="Subtle Emphasis" w:semiHidden="0" w:uiPriority="19" w:unhideWhenUsed="0" w:qFormat="1"/>
+    <w:lsdException w:name="Intense Emphasis" w:semiHidden="0" w:uiPriority="21" w:unhideWhenUsed="0" w:qFormat="1"/>
+    <w:lsdException w:name="Subtle Reference" w:semiHidden="0" w:uiPriority="31" w:unhideWhenUsed="0" w:qFormat="1"/>
+    <w:lsdException w:name="Intense Reference" w:semiHidden="0" w:uiPriority="32" w:unhideWhenUsed="0" w:qFormat="1"/>
+    <w:lsdException w:name="Book Title" w:semiHidden="0" w:uiPriority="33" w:unhideWhenUsed="0" w:qFormat="1"/>
+    <w:lsdException w:name="Bibliography" w:uiPriority="37"/>
+    <w:lsdException w:name="TOC Heading" w:uiPriority="39" w:qFormat="1"/>
   </w:latentStyles>
   <w:style w:type="paragraph" w:default="1" w:styleId="Normal">
     <w:name w:val="Normal"/>
@@ -5569,6 +5320,7 @@
     <w:uiPriority w:val="59"/>
     <w:rsid w:val="006930BA"/>
     <w:tblPr>
+      <w:tblInd w:w="0" w:type="dxa"/>
       <w:tblBorders>
         <w:top w:val="single" w:sz="4" w:space="0" w:color="auto"/>
         <w:left w:val="single" w:sz="4" w:space="0" w:color="auto"/>
@@ -5577,6 +5329,505 @@
         <w:insideH w:val="single" w:sz="4" w:space="0" w:color="auto"/>
         <w:insideV w:val="single" w:sz="4" w:space="0" w:color="auto"/>
       </w:tblBorders>
+      <w:tblCellMar>
+        <w:top w:w="0" w:type="dxa"/>
+        <w:left w:w="108" w:type="dxa"/>
+        <w:bottom w:w="0" w:type="dxa"/>
+        <w:right w:w="108" w:type="dxa"/>
+      </w:tblCellMar>
+    </w:tblPr>
+  </w:style>
+  <w:style w:type="character" w:customStyle="1" w:styleId="Textoindependiente2Car">
+    <w:name w:val="Texto independiente 2 Car"/>
+    <w:basedOn w:val="Fuentedeprrafopredeter"/>
+    <w:link w:val="Textoindependiente2"/>
+    <w:rsid w:val="00B46B8E"/>
+    <w:rPr>
+      <w:sz w:val="24"/>
+      <w:lang w:val="es-CO"/>
+    </w:rPr>
+  </w:style>
+  <w:style w:type="paragraph" w:styleId="Revisin">
+    <w:name w:val="Revision"/>
+    <w:hidden/>
+    <w:uiPriority w:val="99"/>
+    <w:semiHidden/>
+    <w:rsid w:val="008B7E58"/>
+  </w:style>
+  <w:style w:type="paragraph" w:styleId="Prrafodelista">
+    <w:name w:val="List Paragraph"/>
+    <w:basedOn w:val="Normal"/>
+    <w:uiPriority w:val="34"/>
+    <w:qFormat/>
+    <w:rsid w:val="00043DB2"/>
+    <w:pPr>
+      <w:ind w:left="720"/>
+      <w:contextualSpacing/>
+    </w:pPr>
+  </w:style>
+</w:styles>
+</file>
+
+<file path=word/stylesWithEffects.xml><?xml version="1.0" encoding="utf-8"?>
+<w:styles xmlns:wpc="http://schemas.microsoft.com/office/word/2010/wordprocessingCanvas" xmlns:mc="http://schemas.openxmlformats.org/markup-compatibility/2006" xmlns:o="urn:schemas-microsoft-com:office:office" xmlns:r="http://schemas.openxmlformats.org/officeDocument/2006/relationships" xmlns:m="http://schemas.openxmlformats.org/officeDocument/2006/math" xmlns:v="urn:schemas-microsoft-com:vml" xmlns:wp14="http://schemas.microsoft.com/office/word/2010/wordprocessingDrawing" xmlns:wp="http://schemas.openxmlformats.org/drawingml/2006/wordprocessingDrawing" xmlns:w10="urn:schemas-microsoft-com:office:word" xmlns:w="http://schemas.openxmlformats.org/wordprocessingml/2006/main" xmlns:w14="http://schemas.microsoft.com/office/word/2010/wordml" xmlns:wpg="http://schemas.microsoft.com/office/word/2010/wordprocessingGroup" xmlns:wpi="http://schemas.microsoft.com/office/word/2010/wordprocessingInk" xmlns:wne="http://schemas.microsoft.com/office/word/2006/wordml" xmlns:wps="http://schemas.microsoft.com/office/word/2010/wordprocessingShape" mc:Ignorable="w14 wp14">
+  <w:docDefaults>
+    <w:rPrDefault>
+      <w:rPr>
+        <w:rFonts w:ascii="Times New Roman" w:eastAsia="Times New Roman" w:hAnsi="Times New Roman" w:cs="Times New Roman"/>
+        <w:lang w:val="es-ES" w:eastAsia="es-ES" w:bidi="ar-SA"/>
+      </w:rPr>
+    </w:rPrDefault>
+    <w:pPrDefault/>
+  </w:docDefaults>
+  <w:latentStyles w:defLockedState="0" w:defUIPriority="99" w:defSemiHidden="1" w:defUnhideWhenUsed="1" w:defQFormat="0" w:count="267">
+    <w:lsdException w:name="Normal" w:semiHidden="0" w:uiPriority="0" w:unhideWhenUsed="0" w:qFormat="1"/>
+    <w:lsdException w:name="heading 1" w:semiHidden="0" w:uiPriority="9" w:unhideWhenUsed="0" w:qFormat="1"/>
+    <w:lsdException w:name="heading 2" w:uiPriority="9" w:qFormat="1"/>
+    <w:lsdException w:name="heading 3" w:uiPriority="9" w:qFormat="1"/>
+    <w:lsdException w:name="heading 4" w:uiPriority="9" w:qFormat="1"/>
+    <w:lsdException w:name="heading 5" w:uiPriority="9" w:qFormat="1"/>
+    <w:lsdException w:name="heading 6" w:uiPriority="9" w:qFormat="1"/>
+    <w:lsdException w:name="heading 7" w:uiPriority="9" w:qFormat="1"/>
+    <w:lsdException w:name="heading 8" w:uiPriority="9" w:qFormat="1"/>
+    <w:lsdException w:name="heading 9" w:uiPriority="9" w:qFormat="1"/>
+    <w:lsdException w:name="toc 1" w:uiPriority="39"/>
+    <w:lsdException w:name="toc 2" w:uiPriority="39"/>
+    <w:lsdException w:name="toc 3" w:uiPriority="39"/>
+    <w:lsdException w:name="toc 4" w:uiPriority="39"/>
+    <w:lsdException w:name="toc 5" w:uiPriority="39"/>
+    <w:lsdException w:name="toc 6" w:uiPriority="39"/>
+    <w:lsdException w:name="toc 7" w:uiPriority="39"/>
+    <w:lsdException w:name="toc 8" w:uiPriority="39"/>
+    <w:lsdException w:name="toc 9" w:uiPriority="39"/>
+    <w:lsdException w:name="caption" w:uiPriority="35" w:qFormat="1"/>
+    <w:lsdException w:name="Title" w:semiHidden="0" w:uiPriority="10" w:unhideWhenUsed="0" w:qFormat="1"/>
+    <w:lsdException w:name="Default Paragraph Font" w:uiPriority="1"/>
+    <w:lsdException w:name="Subtitle" w:semiHidden="0" w:uiPriority="11" w:unhideWhenUsed="0" w:qFormat="1"/>
+    <w:lsdException w:name="Body Text 2" w:uiPriority="0"/>
+    <w:lsdException w:name="Strong" w:semiHidden="0" w:uiPriority="22" w:unhideWhenUsed="0" w:qFormat="1"/>
+    <w:lsdException w:name="Emphasis" w:semiHidden="0" w:uiPriority="20" w:unhideWhenUsed="0" w:qFormat="1"/>
+    <w:lsdException w:name="Table Grid" w:semiHidden="0" w:uiPriority="59" w:unhideWhenUsed="0"/>
+    <w:lsdException w:name="Placeholder Text" w:unhideWhenUsed="0"/>
+    <w:lsdException w:name="No Spacing" w:semiHidden="0" w:uiPriority="1" w:unhideWhenUsed="0" w:qFormat="1"/>
+    <w:lsdException w:name="Light Shading" w:semiHidden="0" w:uiPriority="60" w:unhideWhenUsed="0"/>
+    <w:lsdException w:name="Light List" w:semiHidden="0" w:uiPriority="61" w:unhideWhenUsed="0"/>
+    <w:lsdException w:name="Light Grid" w:semiHidden="0" w:uiPriority="62" w:unhideWhenUsed="0"/>
+    <w:lsdException w:name="Medium Shading 1" w:semiHidden="0" w:uiPriority="63" w:unhideWhenUsed="0"/>
+    <w:lsdException w:name="Medium Shading 2" w:semiHidden="0" w:uiPriority="64" w:unhideWhenUsed="0"/>
+    <w:lsdException w:name="Medium List 1" w:semiHidden="0" w:uiPriority="65" w:unhideWhenUsed="0"/>
+    <w:lsdException w:name="Medium List 2" w:semiHidden="0" w:uiPriority="66" w:unhideWhenUsed="0"/>
+    <w:lsdException w:name="Medium Grid 1" w:semiHidden="0" w:uiPriority="67" w:unhideWhenUsed="0"/>
+    <w:lsdException w:name="Medium Grid 2" w:semiHidden="0" w:uiPriority="68" w:unhideWhenUsed="0"/>
+    <w:lsdException w:name="Medium Grid 3" w:semiHidden="0" w:uiPriority="69" w:unhideWhenUsed="0"/>
+    <w:lsdException w:name="Dark List" w:semiHidden="0" w:uiPriority="70" w:unhideWhenUsed="0"/>
+    <w:lsdException w:name="Colorful Shading" w:semiHidden="0" w:uiPriority="71" w:unhideWhenUsed="0"/>
+    <w:lsdException w:name="Colorful List" w:semiHidden="0" w:uiPriority="72" w:unhideWhenUsed="0"/>
+    <w:lsdException w:name="Colorful Grid" w:semiHidden="0" w:uiPriority="73" w:unhideWhenUsed="0"/>
+    <w:lsdException w:name="Light Shading Accent 1" w:semiHidden="0" w:uiPriority="60" w:unhideWhenUsed="0"/>
+    <w:lsdException w:name="Light List Accent 1" w:semiHidden="0" w:uiPriority="61" w:unhideWhenUsed="0"/>
+    <w:lsdException w:name="Light Grid Accent 1" w:semiHidden="0" w:uiPriority="62" w:unhideWhenUsed="0"/>
+    <w:lsdException w:name="Medium Shading 1 Accent 1" w:semiHidden="0" w:uiPriority="63" w:unhideWhenUsed="0"/>
+    <w:lsdException w:name="Medium Shading 2 Accent 1" w:semiHidden="0" w:uiPriority="64" w:unhideWhenUsed="0"/>
+    <w:lsdException w:name="Medium List 1 Accent 1" w:semiHidden="0" w:uiPriority="65" w:unhideWhenUsed="0"/>
+    <w:lsdException w:name="Revision" w:unhideWhenUsed="0"/>
+    <w:lsdException w:name="List Paragraph" w:semiHidden="0" w:uiPriority="34" w:unhideWhenUsed="0" w:qFormat="1"/>
+    <w:lsdException w:name="Quote" w:semiHidden="0" w:uiPriority="29" w:unhideWhenUsed="0" w:qFormat="1"/>
+    <w:lsdException w:name="Intense Quote" w:semiHidden="0" w:uiPriority="30" w:unhideWhenUsed="0" w:qFormat="1"/>
+    <w:lsdException w:name="Medium List 2 Accent 1" w:semiHidden="0" w:uiPriority="66" w:unhideWhenUsed="0"/>
+    <w:lsdException w:name="Medium Grid 1 Accent 1" w:semiHidden="0" w:uiPriority="67" w:unhideWhenUsed="0"/>
+    <w:lsdException w:name="Medium Grid 2 Accent 1" w:semiHidden="0" w:uiPriority="68" w:unhideWhenUsed="0"/>
+    <w:lsdException w:name="Medium Grid 3 Accent 1" w:semiHidden="0" w:uiPriority="69" w:unhideWhenUsed="0"/>
+    <w:lsdException w:name="Dark List Accent 1" w:semiHidden="0" w:uiPriority="70" w:unhideWhenUsed="0"/>
+    <w:lsdException w:name="Colorful Shading Accent 1" w:semiHidden="0" w:uiPriority="71" w:unhideWhenUsed="0"/>
+    <w:lsdException w:name="Colorful List Accent 1" w:semiHidden="0" w:uiPriority="72" w:unhideWhenUsed="0"/>
+    <w:lsdException w:name="Colorful Grid Accent 1" w:semiHidden="0" w:uiPriority="73" w:unhideWhenUsed="0"/>
+    <w:lsdException w:name="Light Shading Accent 2" w:semiHidden="0" w:uiPriority="60" w:unhideWhenUsed="0"/>
+    <w:lsdException w:name="Light List Accent 2" w:semiHidden="0" w:uiPriority="61" w:unhideWhenUsed="0"/>
+    <w:lsdException w:name="Light Grid Accent 2" w:semiHidden="0" w:uiPriority="62" w:unhideWhenUsed="0"/>
+    <w:lsdException w:name="Medium Shading 1 Accent 2" w:semiHidden="0" w:uiPriority="63" w:unhideWhenUsed="0"/>
+    <w:lsdException w:name="Medium Shading 2 Accent 2" w:semiHidden="0" w:uiPriority="64" w:unhideWhenUsed="0"/>
+    <w:lsdException w:name="Medium List 1 Accent 2" w:semiHidden="0" w:uiPriority="65" w:unhideWhenUsed="0"/>
+    <w:lsdException w:name="Medium List 2 Accent 2" w:semiHidden="0" w:uiPriority="66" w:unhideWhenUsed="0"/>
+    <w:lsdException w:name="Medium Grid 1 Accent 2" w:semiHidden="0" w:uiPriority="67" w:unhideWhenUsed="0"/>
+    <w:lsdException w:name="Medium Grid 2 Accent 2" w:semiHidden="0" w:uiPriority="68" w:unhideWhenUsed="0"/>
+    <w:lsdException w:name="Medium Grid 3 Accent 2" w:semiHidden="0" w:uiPriority="69" w:unhideWhenUsed="0"/>
+    <w:lsdException w:name="Dark List Accent 2" w:semiHidden="0" w:uiPriority="70" w:unhideWhenUsed="0"/>
+    <w:lsdException w:name="Colorful Shading Accent 2" w:semiHidden="0" w:uiPriority="71" w:unhideWhenUsed="0"/>
+    <w:lsdException w:name="Colorful List Accent 2" w:semiHidden="0" w:uiPriority="72" w:unhideWhenUsed="0"/>
+    <w:lsdException w:name="Colorful Grid Accent 2" w:semiHidden="0" w:uiPriority="73" w:unhideWhenUsed="0"/>
+    <w:lsdException w:name="Light Shading Accent 3" w:semiHidden="0" w:uiPriority="60" w:unhideWhenUsed="0"/>
+    <w:lsdException w:name="Light List Accent 3" w:semiHidden="0" w:uiPriority="61" w:unhideWhenUsed="0"/>
+    <w:lsdException w:name="Light Grid Accent 3" w:semiHidden="0" w:uiPriority="62" w:unhideWhenUsed="0"/>
+    <w:lsdException w:name="Medium Shading 1 Accent 3" w:semiHidden="0" w:uiPriority="63" w:unhideWhenUsed="0"/>
+    <w:lsdException w:name="Medium Shading 2 Accent 3" w:semiHidden="0" w:uiPriority="64" w:unhideWhenUsed="0"/>
+    <w:lsdException w:name="Medium List 1 Accent 3" w:semiHidden="0" w:uiPriority="65" w:unhideWhenUsed="0"/>
+    <w:lsdException w:name="Medium List 2 Accent 3" w:semiHidden="0" w:uiPriority="66" w:unhideWhenUsed="0"/>
+    <w:lsdException w:name="Medium Grid 1 Accent 3" w:semiHidden="0" w:uiPriority="67" w:unhideWhenUsed="0"/>
+    <w:lsdException w:name="Medium Grid 2 Accent 3" w:semiHidden="0" w:uiPriority="68" w:unhideWhenUsed="0"/>
+    <w:lsdException w:name="Medium Grid 3 Accent 3" w:semiHidden="0" w:uiPriority="69" w:unhideWhenUsed="0"/>
+    <w:lsdException w:name="Dark List Accent 3" w:semiHidden="0" w:uiPriority="70" w:unhideWhenUsed="0"/>
+    <w:lsdException w:name="Colorful Shading Accent 3" w:semiHidden="0" w:uiPriority="71" w:unhideWhenUsed="0"/>
+    <w:lsdException w:name="Colorful List Accent 3" w:semiHidden="0" w:uiPriority="72" w:unhideWhenUsed="0"/>
+    <w:lsdException w:name="Colorful Grid Accent 3" w:semiHidden="0" w:uiPriority="73" w:unhideWhenUsed="0"/>
+    <w:lsdException w:name="Light Shading Accent 4" w:semiHidden="0" w:uiPriority="60" w:unhideWhenUsed="0"/>
+    <w:lsdException w:name="Light List Accent 4" w:semiHidden="0" w:uiPriority="61" w:unhideWhenUsed="0"/>
+    <w:lsdException w:name="Light Grid Accent 4" w:semiHidden="0" w:uiPriority="62" w:unhideWhenUsed="0"/>
+    <w:lsdException w:name="Medium Shading 1 Accent 4" w:semiHidden="0" w:uiPriority="63" w:unhideWhenUsed="0"/>
+    <w:lsdException w:name="Medium Shading 2 Accent 4" w:semiHidden="0" w:uiPriority="64" w:unhideWhenUsed="0"/>
+    <w:lsdException w:name="Medium List 1 Accent 4" w:semiHidden="0" w:uiPriority="65" w:unhideWhenUsed="0"/>
+    <w:lsdException w:name="Medium List 2 Accent 4" w:semiHidden="0" w:uiPriority="66" w:unhideWhenUsed="0"/>
+    <w:lsdException w:name="Medium Grid 1 Accent 4" w:semiHidden="0" w:uiPriority="67" w:unhideWhenUsed="0"/>
+    <w:lsdException w:name="Medium Grid 2 Accent 4" w:semiHidden="0" w:uiPriority="68" w:unhideWhenUsed="0"/>
+    <w:lsdException w:name="Medium Grid 3 Accent 4" w:semiHidden="0" w:uiPriority="69" w:unhideWhenUsed="0"/>
+    <w:lsdException w:name="Dark List Accent 4" w:semiHidden="0" w:uiPriority="70" w:unhideWhenUsed="0"/>
+    <w:lsdException w:name="Colorful Shading Accent 4" w:semiHidden="0" w:uiPriority="71" w:unhideWhenUsed="0"/>
+    <w:lsdException w:name="Colorful List Accent 4" w:semiHidden="0" w:uiPriority="72" w:unhideWhenUsed="0"/>
+    <w:lsdException w:name="Colorful Grid Accent 4" w:semiHidden="0" w:uiPriority="73" w:unhideWhenUsed="0"/>
+    <w:lsdException w:name="Light Shading Accent 5" w:semiHidden="0" w:uiPriority="60" w:unhideWhenUsed="0"/>
+    <w:lsdException w:name="Light List Accent 5" w:semiHidden="0" w:uiPriority="61" w:unhideWhenUsed="0"/>
+    <w:lsdException w:name="Light Grid Accent 5" w:semiHidden="0" w:uiPriority="62" w:unhideWhenUsed="0"/>
+    <w:lsdException w:name="Medium Shading 1 Accent 5" w:semiHidden="0" w:uiPriority="63" w:unhideWhenUsed="0"/>
+    <w:lsdException w:name="Medium Shading 2 Accent 5" w:semiHidden="0" w:uiPriority="64" w:unhideWhenUsed="0"/>
+    <w:lsdException w:name="Medium List 1 Accent 5" w:semiHidden="0" w:uiPriority="65" w:unhideWhenUsed="0"/>
+    <w:lsdException w:name="Medium List 2 Accent 5" w:semiHidden="0" w:uiPriority="66" w:unhideWhenUsed="0"/>
+    <w:lsdException w:name="Medium Grid 1 Accent 5" w:semiHidden="0" w:uiPriority="67" w:unhideWhenUsed="0"/>
+    <w:lsdException w:name="Medium Grid 2 Accent 5" w:semiHidden="0" w:uiPriority="68" w:unhideWhenUsed="0"/>
+    <w:lsdException w:name="Medium Grid 3 Accent 5" w:semiHidden="0" w:uiPriority="69" w:unhideWhenUsed="0"/>
+    <w:lsdException w:name="Dark List Accent 5" w:semiHidden="0" w:uiPriority="70" w:unhideWhenUsed="0"/>
+    <w:lsdException w:name="Colorful Shading Accent 5" w:semiHidden="0" w:uiPriority="71" w:unhideWhenUsed="0"/>
+    <w:lsdException w:name="Colorful List Accent 5" w:semiHidden="0" w:uiPriority="72" w:unhideWhenUsed="0"/>
+    <w:lsdException w:name="Colorful Grid Accent 5" w:semiHidden="0" w:uiPriority="73" w:unhideWhenUsed="0"/>
+    <w:lsdException w:name="Light Shading Accent 6" w:semiHidden="0" w:uiPriority="60" w:unhideWhenUsed="0"/>
+    <w:lsdException w:name="Light List Accent 6" w:semiHidden="0" w:uiPriority="61" w:unhideWhenUsed="0"/>
+    <w:lsdException w:name="Light Grid Accent 6" w:semiHidden="0" w:uiPriority="62" w:unhideWhenUsed="0"/>
+    <w:lsdException w:name="Medium Shading 1 Accent 6" w:semiHidden="0" w:uiPriority="63" w:unhideWhenUsed="0"/>
+    <w:lsdException w:name="Medium Shading 2 Accent 6" w:semiHidden="0" w:uiPriority="64" w:unhideWhenUsed="0"/>
+    <w:lsdException w:name="Medium List 1 Accent 6" w:semiHidden="0" w:uiPriority="65" w:unhideWhenUsed="0"/>
+    <w:lsdException w:name="Medium List 2 Accent 6" w:semiHidden="0" w:uiPriority="66" w:unhideWhenUsed="0"/>
+    <w:lsdException w:name="Medium Grid 1 Accent 6" w:semiHidden="0" w:uiPriority="67" w:unhideWhenUsed="0"/>
+    <w:lsdException w:name="Medium Grid 2 Accent 6" w:semiHidden="0" w:uiPriority="68" w:unhideWhenUsed="0"/>
+    <w:lsdException w:name="Medium Grid 3 Accent 6" w:semiHidden="0" w:uiPriority="69" w:unhideWhenUsed="0"/>
+    <w:lsdException w:name="Dark List Accent 6" w:semiHidden="0" w:uiPriority="70" w:unhideWhenUsed="0"/>
+    <w:lsdException w:name="Colorful Shading Accent 6" w:semiHidden="0" w:uiPriority="71" w:unhideWhenUsed="0"/>
+    <w:lsdException w:name="Colorful List Accent 6" w:semiHidden="0" w:uiPriority="72" w:unhideWhenUsed="0"/>
+    <w:lsdException w:name="Colorful Grid Accent 6" w:semiHidden="0" w:uiPriority="73" w:unhideWhenUsed="0"/>
+    <w:lsdException w:name="Subtle Emphasis" w:semiHidden="0" w:uiPriority="19" w:unhideWhenUsed="0" w:qFormat="1"/>
+    <w:lsdException w:name="Intense Emphasis" w:semiHidden="0" w:uiPriority="21" w:unhideWhenUsed="0" w:qFormat="1"/>
+    <w:lsdException w:name="Subtle Reference" w:semiHidden="0" w:uiPriority="31" w:unhideWhenUsed="0" w:qFormat="1"/>
+    <w:lsdException w:name="Intense Reference" w:semiHidden="0" w:uiPriority="32" w:unhideWhenUsed="0" w:qFormat="1"/>
+    <w:lsdException w:name="Book Title" w:semiHidden="0" w:uiPriority="33" w:unhideWhenUsed="0" w:qFormat="1"/>
+    <w:lsdException w:name="Bibliography" w:uiPriority="37"/>
+    <w:lsdException w:name="TOC Heading" w:uiPriority="39" w:qFormat="1"/>
+  </w:latentStyles>
+  <w:style w:type="paragraph" w:default="1" w:styleId="Normal">
+    <w:name w:val="Normal"/>
+    <w:pPr>
+      <w:suppressAutoHyphens/>
+      <w:autoSpaceDN w:val="0"/>
+      <w:textAlignment w:val="baseline"/>
+    </w:pPr>
+  </w:style>
+  <w:style w:type="paragraph" w:styleId="Ttulo1">
+    <w:name w:val="heading 1"/>
+    <w:basedOn w:val="Normal"/>
+    <w:next w:val="Normal"/>
+    <w:pPr>
+      <w:keepNext/>
+      <w:outlineLvl w:val="0"/>
+    </w:pPr>
+    <w:rPr>
+      <w:sz w:val="24"/>
+      <w:lang w:val="es-CO"/>
+    </w:rPr>
+  </w:style>
+  <w:style w:type="paragraph" w:styleId="Ttulo2">
+    <w:name w:val="heading 2"/>
+    <w:basedOn w:val="Normal"/>
+    <w:next w:val="Normal"/>
+    <w:pPr>
+      <w:keepNext/>
+      <w:jc w:val="center"/>
+      <w:outlineLvl w:val="1"/>
+    </w:pPr>
+    <w:rPr>
+      <w:sz w:val="24"/>
+      <w:lang w:val="es-CO"/>
+    </w:rPr>
+  </w:style>
+  <w:style w:type="paragraph" w:styleId="Ttulo3">
+    <w:name w:val="heading 3"/>
+    <w:basedOn w:val="Normal"/>
+    <w:next w:val="Normal"/>
+    <w:pPr>
+      <w:keepNext/>
+      <w:spacing w:line="480" w:lineRule="auto"/>
+      <w:jc w:val="center"/>
+      <w:outlineLvl w:val="2"/>
+    </w:pPr>
+    <w:rPr>
+      <w:b/>
+      <w:sz w:val="32"/>
+      <w:lang w:val="es-CO"/>
+    </w:rPr>
+  </w:style>
+  <w:style w:type="paragraph" w:styleId="Ttulo4">
+    <w:name w:val="heading 4"/>
+    <w:basedOn w:val="Normal"/>
+    <w:next w:val="Normal"/>
+    <w:pPr>
+      <w:keepNext/>
+      <w:spacing w:line="480" w:lineRule="auto"/>
+      <w:jc w:val="center"/>
+      <w:outlineLvl w:val="3"/>
+    </w:pPr>
+    <w:rPr>
+      <w:b/>
+      <w:sz w:val="24"/>
+      <w:lang w:val="es-CO"/>
+    </w:rPr>
+  </w:style>
+  <w:style w:type="paragraph" w:styleId="Ttulo5">
+    <w:name w:val="heading 5"/>
+    <w:basedOn w:val="Normal"/>
+    <w:next w:val="Normal"/>
+    <w:pPr>
+      <w:keepNext/>
+      <w:spacing w:line="480" w:lineRule="auto"/>
+      <w:outlineLvl w:val="4"/>
+    </w:pPr>
+    <w:rPr>
+      <w:b/>
+      <w:sz w:val="24"/>
+      <w:lang w:val="es-CO"/>
+    </w:rPr>
+  </w:style>
+  <w:style w:type="character" w:default="1" w:styleId="Fuentedeprrafopredeter">
+    <w:name w:val="Default Paragraph Font"/>
+    <w:uiPriority w:val="1"/>
+    <w:semiHidden/>
+    <w:unhideWhenUsed/>
+  </w:style>
+  <w:style w:type="table" w:default="1" w:styleId="Tablanormal">
+    <w:name w:val="Normal Table"/>
+    <w:uiPriority w:val="99"/>
+    <w:semiHidden/>
+    <w:unhideWhenUsed/>
+    <w:tblPr>
+      <w:tblInd w:w="0" w:type="dxa"/>
+      <w:tblCellMar>
+        <w:top w:w="0" w:type="dxa"/>
+        <w:left w:w="108" w:type="dxa"/>
+        <w:bottom w:w="0" w:type="dxa"/>
+        <w:right w:w="108" w:type="dxa"/>
+      </w:tblCellMar>
+    </w:tblPr>
+  </w:style>
+  <w:style w:type="numbering" w:default="1" w:styleId="Sinlista">
+    <w:name w:val="No List"/>
+    <w:uiPriority w:val="99"/>
+    <w:semiHidden/>
+    <w:unhideWhenUsed/>
+  </w:style>
+  <w:style w:type="paragraph" w:styleId="Textoindependiente">
+    <w:name w:val="Body Text"/>
+    <w:basedOn w:val="Normal"/>
+    <w:pPr>
+      <w:spacing w:line="480" w:lineRule="auto"/>
+    </w:pPr>
+    <w:rPr>
+      <w:sz w:val="24"/>
+      <w:lang w:val="es-CO"/>
+    </w:rPr>
+  </w:style>
+  <w:style w:type="paragraph" w:styleId="Textoindependiente2">
+    <w:name w:val="Body Text 2"/>
+    <w:basedOn w:val="Normal"/>
+    <w:link w:val="Textoindependiente2Car"/>
+    <w:pPr>
+      <w:spacing w:line="480" w:lineRule="auto"/>
+      <w:jc w:val="both"/>
+    </w:pPr>
+    <w:rPr>
+      <w:sz w:val="24"/>
+      <w:lang w:val="es-CO"/>
+    </w:rPr>
+  </w:style>
+  <w:style w:type="paragraph" w:styleId="Encabezado">
+    <w:name w:val="header"/>
+    <w:basedOn w:val="Normal"/>
+    <w:uiPriority w:val="99"/>
+    <w:pPr>
+      <w:tabs>
+        <w:tab w:val="center" w:pos="4252"/>
+        <w:tab w:val="right" w:pos="8504"/>
+      </w:tabs>
+    </w:pPr>
+  </w:style>
+  <w:style w:type="paragraph" w:styleId="Piedepgina">
+    <w:name w:val="footer"/>
+    <w:basedOn w:val="Normal"/>
+    <w:pPr>
+      <w:tabs>
+        <w:tab w:val="center" w:pos="4252"/>
+        <w:tab w:val="right" w:pos="8504"/>
+      </w:tabs>
+    </w:pPr>
+  </w:style>
+  <w:style w:type="paragraph" w:styleId="Mapadeldocumento">
+    <w:name w:val="Document Map"/>
+    <w:basedOn w:val="Normal"/>
+    <w:pPr>
+      <w:shd w:val="clear" w:color="auto" w:fill="000080"/>
+    </w:pPr>
+    <w:rPr>
+      <w:rFonts w:ascii="Tahoma" w:hAnsi="Tahoma" w:cs="Tahoma"/>
+    </w:rPr>
+  </w:style>
+  <w:style w:type="paragraph" w:styleId="Textodeglobo">
+    <w:name w:val="Balloon Text"/>
+    <w:basedOn w:val="Normal"/>
+    <w:rPr>
+      <w:rFonts w:ascii="Tahoma" w:hAnsi="Tahoma" w:cs="Tahoma"/>
+      <w:sz w:val="16"/>
+      <w:szCs w:val="16"/>
+    </w:rPr>
+  </w:style>
+  <w:style w:type="character" w:styleId="Nmerodepgina">
+    <w:name w:val="page number"/>
+    <w:basedOn w:val="Fuentedeprrafopredeter"/>
+  </w:style>
+  <w:style w:type="character" w:styleId="Hipervnculo">
+    <w:name w:val="Hyperlink"/>
+    <w:rPr>
+      <w:color w:val="0000FF"/>
+      <w:u w:val="single"/>
+    </w:rPr>
+  </w:style>
+  <w:style w:type="character" w:customStyle="1" w:styleId="PiedepginaCar">
+    <w:name w:val="Pie de página Car"/>
+    <w:rPr>
+      <w:lang w:eastAsia="es-ES"/>
+    </w:rPr>
+  </w:style>
+  <w:style w:type="paragraph" w:styleId="Textonotapie">
+    <w:name w:val="footnote text"/>
+    <w:basedOn w:val="Normal"/>
+  </w:style>
+  <w:style w:type="character" w:customStyle="1" w:styleId="TextonotapieCar">
+    <w:name w:val="Texto nota pie Car"/>
+    <w:rPr>
+      <w:lang w:eastAsia="es-ES"/>
+    </w:rPr>
+  </w:style>
+  <w:style w:type="character" w:styleId="Refdenotaalpie">
+    <w:name w:val="footnote reference"/>
+    <w:rPr>
+      <w:position w:val="0"/>
+      <w:vertAlign w:val="superscript"/>
+    </w:rPr>
+  </w:style>
+  <w:style w:type="character" w:customStyle="1" w:styleId="EncabezadoCar">
+    <w:name w:val="Encabezado Car"/>
+    <w:uiPriority w:val="99"/>
+    <w:rPr>
+      <w:lang w:eastAsia="es-ES"/>
+    </w:rPr>
+  </w:style>
+  <w:style w:type="paragraph" w:styleId="NormalWeb">
+    <w:name w:val="Normal (Web)"/>
+    <w:basedOn w:val="Normal"/>
+    <w:uiPriority w:val="99"/>
+    <w:unhideWhenUsed/>
+    <w:rsid w:val="00780F5E"/>
+    <w:pPr>
+      <w:suppressAutoHyphens w:val="0"/>
+      <w:autoSpaceDN/>
+      <w:spacing w:before="100" w:beforeAutospacing="1" w:after="100" w:afterAutospacing="1"/>
+      <w:textAlignment w:val="auto"/>
+    </w:pPr>
+    <w:rPr>
+      <w:rFonts w:eastAsiaTheme="minorEastAsia"/>
+      <w:sz w:val="24"/>
+      <w:szCs w:val="24"/>
+      <w:lang w:val="es-CO" w:eastAsia="es-CO"/>
+    </w:rPr>
+  </w:style>
+  <w:style w:type="character" w:styleId="Refdecomentario">
+    <w:name w:val="annotation reference"/>
+    <w:basedOn w:val="Fuentedeprrafopredeter"/>
+    <w:uiPriority w:val="99"/>
+    <w:semiHidden/>
+    <w:unhideWhenUsed/>
+    <w:rsid w:val="006C4CA9"/>
+    <w:rPr>
+      <w:sz w:val="16"/>
+      <w:szCs w:val="16"/>
+    </w:rPr>
+  </w:style>
+  <w:style w:type="paragraph" w:styleId="Textocomentario">
+    <w:name w:val="annotation text"/>
+    <w:basedOn w:val="Normal"/>
+    <w:link w:val="TextocomentarioCar"/>
+    <w:uiPriority w:val="99"/>
+    <w:semiHidden/>
+    <w:unhideWhenUsed/>
+    <w:rsid w:val="006C4CA9"/>
+  </w:style>
+  <w:style w:type="character" w:customStyle="1" w:styleId="TextocomentarioCar">
+    <w:name w:val="Texto comentario Car"/>
+    <w:basedOn w:val="Fuentedeprrafopredeter"/>
+    <w:link w:val="Textocomentario"/>
+    <w:uiPriority w:val="99"/>
+    <w:semiHidden/>
+    <w:rsid w:val="006C4CA9"/>
+  </w:style>
+  <w:style w:type="paragraph" w:styleId="Asuntodelcomentario">
+    <w:name w:val="annotation subject"/>
+    <w:basedOn w:val="Textocomentario"/>
+    <w:next w:val="Textocomentario"/>
+    <w:link w:val="AsuntodelcomentarioCar"/>
+    <w:uiPriority w:val="99"/>
+    <w:semiHidden/>
+    <w:unhideWhenUsed/>
+    <w:rsid w:val="006C4CA9"/>
+    <w:rPr>
+      <w:b/>
+      <w:bCs/>
+    </w:rPr>
+  </w:style>
+  <w:style w:type="character" w:customStyle="1" w:styleId="AsuntodelcomentarioCar">
+    <w:name w:val="Asunto del comentario Car"/>
+    <w:basedOn w:val="TextocomentarioCar"/>
+    <w:link w:val="Asuntodelcomentario"/>
+    <w:uiPriority w:val="99"/>
+    <w:semiHidden/>
+    <w:rsid w:val="006C4CA9"/>
+    <w:rPr>
+      <w:b/>
+      <w:bCs/>
+    </w:rPr>
+  </w:style>
+  <w:style w:type="table" w:styleId="Tablaconcuadrcula">
+    <w:name w:val="Table Grid"/>
+    <w:basedOn w:val="Tablanormal"/>
+    <w:uiPriority w:val="59"/>
+    <w:rsid w:val="006930BA"/>
+    <w:tblPr>
+      <w:tblInd w:w="0" w:type="dxa"/>
+      <w:tblBorders>
+        <w:top w:val="single" w:sz="4" w:space="0" w:color="auto"/>
+        <w:left w:val="single" w:sz="4" w:space="0" w:color="auto"/>
+        <w:bottom w:val="single" w:sz="4" w:space="0" w:color="auto"/>
+        <w:right w:val="single" w:sz="4" w:space="0" w:color="auto"/>
+        <w:insideH w:val="single" w:sz="4" w:space="0" w:color="auto"/>
+        <w:insideV w:val="single" w:sz="4" w:space="0" w:color="auto"/>
+      </w:tblBorders>
+      <w:tblCellMar>
+        <w:top w:w="0" w:type="dxa"/>
+        <w:left w:w="108" w:type="dxa"/>
+        <w:bottom w:w="0" w:type="dxa"/>
+        <w:right w:w="108" w:type="dxa"/>
+      </w:tblCellMar>
     </w:tblPr>
   </w:style>
   <w:style w:type="character" w:customStyle="1" w:styleId="Textoindependiente2Car">
@@ -5898,7 +6149,7 @@
 </file>
 
 <file path=customXml/itemProps1.xml><?xml version="1.0" encoding="utf-8"?>
-<ds:datastoreItem xmlns:ds="http://schemas.openxmlformats.org/officeDocument/2006/customXml" ds:itemID="{21EEFF2D-23E6-4B32-8A6E-460B478E8870}">
+<ds:datastoreItem xmlns:ds="http://schemas.openxmlformats.org/officeDocument/2006/customXml" ds:itemID="{9A0C0756-1091-431D-BC2F-58E47DAE277E}">
   <ds:schemaRefs>
     <ds:schemaRef ds:uri="http://schemas.openxmlformats.org/officeDocument/2006/bibliography"/>
   </ds:schemaRefs>

</xml_diff>